<commit_message>
Added the AI and Team governance
</commit_message>
<xml_diff>
--- a/CivicConnect_SEN381 Milestone 1.docx
+++ b/CivicConnect_SEN381 Milestone 1.docx
@@ -1,16 +1,2709 @@
 
 <file path=word/document.xml><?xml version="1.0" encoding="utf-8"?>
-<w:document xmlns:wpc="http://schemas.microsoft.com/office/word/2010/wordprocessingCanvas" xmlns:mc="http://schemas.openxmlformats.org/markup-compatibility/2006" xmlns:o="urn:schemas-microsoft-com:office:office" xmlns:r="http://schemas.openxmlformats.org/officeDocument/2006/relationships" xmlns:m="http://schemas.openxmlformats.org/officeDocument/2006/math" xmlns:v="urn:schemas-microsoft-com:vml" xmlns:wp14="http://schemas.microsoft.com/office/word/2010/wordprocessingDrawing" xmlns:wp="http://schemas.openxmlformats.org/drawingml/2006/wordprocessingDrawing" xmlns:w10="urn:schemas-microsoft-com:office:word" xmlns:w="http://schemas.openxmlformats.org/wordprocessingml/2006/main" xmlns:w14="http://schemas.microsoft.com/office/word/2010/wordml" xmlns:w15="http://schemas.microsoft.com/office/word/2012/wordml" xmlns:wpg="http://schemas.microsoft.com/office/word/2010/wordprocessingGroup" xmlns:wpi="http://schemas.microsoft.com/office/word/2010/wordprocessingInk" xmlns:wne="http://schemas.microsoft.com/office/word/2006/wordml" xmlns:wps="http://schemas.microsoft.com/office/word/2010/wordprocessingShape" xmlns:w16se="http://schemas.microsoft.com/office/word/2015/wordml/symex" xmlns:w16cid="http://schemas.microsoft.com/office/word/2016/wordml/cid" xmlns:w16="http://schemas.microsoft.com/office/word/2018/wordml" xmlns:w16cex="http://schemas.microsoft.com/office/word/2018/wordml/cex" xmlns:w16sdtdh="http://schemas.microsoft.com/office/word/2020/wordml/sdtdatahash" xmlns:w16sdtfl="http://schemas.microsoft.com/office/word/2024/wordml/sdtformatlock" mc:Ignorable="w14 w15 wp14 w16se w16cid w16 w16cex w16sdtdh w16sdtfl">
+<w:document xmlns:wpc="http://schemas.microsoft.com/office/word/2010/wordprocessingCanvas" xmlns:mc="http://schemas.openxmlformats.org/markup-compatibility/2006" xmlns:o="urn:schemas-microsoft-com:office:office" xmlns:r="http://schemas.openxmlformats.org/officeDocument/2006/relationships" xmlns:m="http://schemas.openxmlformats.org/officeDocument/2006/math" xmlns:v="urn:schemas-microsoft-com:vml" xmlns:wp14="http://schemas.microsoft.com/office/word/2010/wordprocessingDrawing" xmlns:wp="http://schemas.openxmlformats.org/drawingml/2006/wordprocessingDrawing" xmlns:w10="urn:schemas-microsoft-com:office:word" xmlns:w="http://schemas.openxmlformats.org/wordprocessingml/2006/main" xmlns:w14="http://schemas.microsoft.com/office/word/2010/wordml" xmlns:w15="http://schemas.microsoft.com/office/word/2012/wordml" xmlns:wpg="http://schemas.microsoft.com/office/word/2010/wordprocessingGroup" xmlns:wpi="http://schemas.microsoft.com/office/word/2010/wordprocessingInk" xmlns:wne="http://schemas.microsoft.com/office/word/2006/wordml" xmlns:wps="http://schemas.microsoft.com/office/word/2010/wordprocessingShape" xmlns:w16se="http://schemas.microsoft.com/office/word/2015/wordml/symex" xmlns:w16cid="http://schemas.microsoft.com/office/word/2016/wordml/cid" xmlns:w16="http://schemas.microsoft.com/office/word/2018/wordml" xmlns:w16cex="http://schemas.microsoft.com/office/word/2018/wordml/cex" xmlns:w16sdtdh="http://schemas.microsoft.com/office/word/2020/wordml/sdtdatahash" xmlns:w16sdtfl="http://schemas.microsoft.com/office/word/2024/wordml/sdtformatlock" xmlns:a="http://schemas.openxmlformats.org/drawingml/2006/main" xmlns:pic="http://schemas.openxmlformats.org/drawingml/2006/picture" xmlns:a14="http://schemas.microsoft.com/office/drawing/2010/main" mc:Ignorable="w14 w15 wp14 w16se w16cid w16 w16cex w16sdtdh w16sdtfl">
   <w:body>
-    <w:p xmlns:wp14="http://schemas.microsoft.com/office/word/2010/wordml" wp14:paraId="2C078E63" wp14:textId="77777777"/>
+    <w:p xmlns:wp14="http://schemas.microsoft.com/office/word/2010/wordml" wp14:paraId="49BE0179" wp14:textId="661E7B6F">
+      <w:pPr>
+        <w:pStyle w:val="Heading1"/>
+        <w:keepNext w:val="1"/>
+        <w:keepLines w:val="1"/>
+        <w:spacing w:before="360" w:after="80"/>
+        <w:rPr>
+          <w:rFonts w:ascii="Aptos Display" w:hAnsi="Aptos Display" w:eastAsia="Aptos Display" w:cs="Aptos Display"/>
+          <w:b w:val="0"/>
+          <w:bCs w:val="0"/>
+          <w:i w:val="0"/>
+          <w:iCs w:val="0"/>
+          <w:caps w:val="0"/>
+          <w:smallCaps w:val="0"/>
+          <w:noProof w:val="0"/>
+          <w:color w:val="0F4761" w:themeColor="accent1" w:themeTint="FF" w:themeShade="BF"/>
+          <w:sz w:val="40"/>
+          <w:szCs w:val="40"/>
+          <w:lang w:val="en-US"/>
+        </w:rPr>
+      </w:pPr>
+      <w:r>
+        <w:rPr>
+          <w:rFonts w:ascii="Aptos Display" w:hAnsi="Aptos Display" w:eastAsia="Aptos Display" w:cs="Aptos Display"/>
+          <w:b w:val="0"/>
+          <w:bCs w:val="0"/>
+          <w:i w:val="0"/>
+          <w:iCs w:val="0"/>
+          <w:caps w:val="0"/>
+          <w:smallCaps w:val="0"/>
+          <w:noProof w:val="0"/>
+          <w:color w:val="0F4761" w:themeColor="accent1" w:themeTint="FF" w:themeShade="BF"/>
+          <w:sz w:val="40"/>
+          <w:szCs w:val="40"/>
+          <w:lang w:val="en-US"/>
+        </w:rPr>
+        <w:t xml:space="preserve">Repository and Team Governance </w:t>
+      </w:r>
+    </w:p>
+    <w:p xmlns:wp14="http://schemas.microsoft.com/office/word/2010/wordml" wp14:paraId="20C67F7F" wp14:textId="701E8E2D">
+      <w:pPr>
+        <w:pStyle w:val="Heading2"/>
+        <w:keepNext w:val="1"/>
+        <w:keepLines w:val="1"/>
+        <w:spacing w:before="160" w:after="80"/>
+        <w:rPr>
+          <w:rFonts w:ascii="Aptos Display" w:hAnsi="Aptos Display" w:eastAsia="Aptos Display" w:cs="Aptos Display"/>
+          <w:b w:val="0"/>
+          <w:bCs w:val="0"/>
+          <w:i w:val="0"/>
+          <w:iCs w:val="0"/>
+          <w:caps w:val="0"/>
+          <w:smallCaps w:val="0"/>
+          <w:noProof w:val="0"/>
+          <w:color w:val="0F4761" w:themeColor="accent1" w:themeTint="FF" w:themeShade="BF"/>
+          <w:sz w:val="32"/>
+          <w:szCs w:val="32"/>
+          <w:lang w:val="en-US"/>
+        </w:rPr>
+      </w:pPr>
+      <w:r>
+        <w:rPr>
+          <w:rFonts w:ascii="Aptos Display" w:hAnsi="Aptos Display" w:eastAsia="Aptos Display" w:cs="Aptos Display"/>
+          <w:b w:val="0"/>
+          <w:bCs w:val="0"/>
+          <w:i w:val="0"/>
+          <w:iCs w:val="0"/>
+          <w:caps w:val="0"/>
+          <w:smallCaps w:val="0"/>
+          <w:noProof w:val="0"/>
+          <w:color w:val="0F4761" w:themeColor="accent1" w:themeTint="FF" w:themeShade="BF"/>
+          <w:sz w:val="32"/>
+          <w:szCs w:val="32"/>
+          <w:lang w:val="en-US"/>
+        </w:rPr>
+        <w:t>Github governance</w:t>
+      </w:r>
+    </w:p>
+    <w:p xmlns:wp14="http://schemas.microsoft.com/office/word/2010/wordml" wp14:paraId="29D8148D" wp14:textId="7C05547E">
+      <w:pPr>
+        <w:rPr>
+          <w:rFonts w:ascii="Aptos" w:hAnsi="Aptos" w:eastAsia="Aptos" w:cs="Aptos"/>
+          <w:b w:val="0"/>
+          <w:bCs w:val="0"/>
+          <w:i w:val="0"/>
+          <w:iCs w:val="0"/>
+          <w:caps w:val="0"/>
+          <w:smallCaps w:val="0"/>
+          <w:noProof w:val="0"/>
+          <w:color w:val="000000" w:themeColor="text1" w:themeTint="FF" w:themeShade="FF"/>
+          <w:sz w:val="24"/>
+          <w:szCs w:val="24"/>
+          <w:lang w:val="en-US"/>
+        </w:rPr>
+      </w:pPr>
+      <w:r>
+        <w:rPr>
+          <w:rFonts w:ascii="Aptos" w:hAnsi="Aptos" w:eastAsia="Aptos" w:cs="Aptos"/>
+          <w:b w:val="0"/>
+          <w:bCs w:val="0"/>
+          <w:i w:val="0"/>
+          <w:iCs w:val="0"/>
+          <w:caps w:val="0"/>
+          <w:smallCaps w:val="0"/>
+          <w:noProof w:val="0"/>
+          <w:color w:val="000000" w:themeColor="text1" w:themeTint="FF" w:themeShade="FF"/>
+          <w:sz w:val="24"/>
+          <w:szCs w:val="24"/>
+          <w:lang w:val="en-US"/>
+        </w:rPr>
+        <w:t>Github governance refers to using rules and controls to manage the development of a software product. For the project, social coding, which is an agile approach for team development, will be used to allow for a collaborative environment (Marius Golombeck, Orlowski and Tübben, 2018). For the governance of the repository, there will be protection rules for the main branch. According to Github (n.d), a custom rule can be applied to a branch, requiring two or more collaborators to approve a request to merge to the main branch. Using this protection rule will help ensure that every piece of code committed to the main branch is tested before approval. It will also ensure that bulk uploads of content that is unverified will not be done.</w:t>
+      </w:r>
+    </w:p>
+    <w:p xmlns:wp14="http://schemas.microsoft.com/office/word/2010/wordml" wp14:paraId="56B51847" wp14:textId="667DC3BE">
+      <w:pPr>
+        <w:rPr>
+          <w:rFonts w:ascii="Aptos" w:hAnsi="Aptos" w:eastAsia="Aptos" w:cs="Aptos"/>
+          <w:b w:val="0"/>
+          <w:bCs w:val="0"/>
+          <w:i w:val="0"/>
+          <w:iCs w:val="0"/>
+          <w:caps w:val="0"/>
+          <w:smallCaps w:val="0"/>
+          <w:noProof w:val="0"/>
+          <w:color w:val="000000" w:themeColor="text1" w:themeTint="FF" w:themeShade="FF"/>
+          <w:sz w:val="24"/>
+          <w:szCs w:val="24"/>
+          <w:lang w:val="en-US"/>
+        </w:rPr>
+      </w:pPr>
+      <w:r>
+        <w:drawing>
+          <wp:inline xmlns:wp14="http://schemas.microsoft.com/office/word/2010/wordprocessingDrawing" wp14:editId="68BCCB1C" wp14:anchorId="44990F41">
+            <wp:extent cx="5943600" cy="3552825"/>
+            <wp:effectExtent l="0" t="0" r="0" b="0"/>
+            <wp:docPr id="751813935" name="drawing"/>
+            <wp:cNvGraphicFramePr>
+              <a:graphicFrameLocks noChangeAspect="1"/>
+            </wp:cNvGraphicFramePr>
+            <a:graphic>
+              <a:graphicData xmlns:a="http://schemas.openxmlformats.org/drawingml/2006/main" uri="http://schemas.openxmlformats.org/drawingml/2006/picture">
+                <pic:pic xmlns:pic="http://schemas.openxmlformats.org/drawingml/2006/picture">
+                  <pic:nvPicPr>
+                    <pic:cNvPr id="751813935" name="Picture 751813935"/>
+                    <pic:cNvPicPr/>
+                  </pic:nvPicPr>
+                  <pic:blipFill>
+                    <a:blip xmlns:r="http://schemas.openxmlformats.org/officeDocument/2006/relationships" r:embed="rId1167363719">
+                      <a:extLst>
+                        <a:ext uri="{28A0092B-C50C-407E-A947-70E740481C1C}">
+                          <a14:useLocalDpi xmlns:a14="http://schemas.microsoft.com/office/drawing/2010/main"/>
+                        </a:ext>
+                      </a:extLst>
+                    </a:blip>
+                    <a:stretch>
+                      <a:fillRect/>
+                    </a:stretch>
+                  </pic:blipFill>
+                  <pic:spPr>
+                    <a:xfrm>
+                      <a:off x="0" y="0"/>
+                      <a:ext cx="5943600" cy="3552825"/>
+                    </a:xfrm>
+                    <a:prstGeom prst="rect">
+                      <a:avLst/>
+                    </a:prstGeom>
+                  </pic:spPr>
+                </pic:pic>
+              </a:graphicData>
+            </a:graphic>
+          </wp:inline>
+        </w:drawing>
+      </w:r>
+      <w:r>
+        <w:rPr>
+          <w:rFonts w:ascii="Aptos" w:hAnsi="Aptos" w:eastAsia="Aptos" w:cs="Aptos"/>
+          <w:b w:val="0"/>
+          <w:bCs w:val="0"/>
+          <w:i w:val="0"/>
+          <w:iCs w:val="0"/>
+          <w:caps w:val="0"/>
+          <w:smallCaps w:val="0"/>
+          <w:noProof w:val="0"/>
+          <w:color w:val="000000" w:themeColor="text1" w:themeTint="FF" w:themeShade="FF"/>
+          <w:sz w:val="24"/>
+          <w:szCs w:val="24"/>
+          <w:lang w:val="en-US"/>
+        </w:rPr>
+        <w:t>Above is the rule set that will be applied for the other milestones of our project.</w:t>
+      </w:r>
+    </w:p>
+    <w:p xmlns:wp14="http://schemas.microsoft.com/office/word/2010/wordml" wp14:paraId="21A4B070" wp14:textId="4581CA0F">
+      <w:pPr>
+        <w:pStyle w:val="Heading2"/>
+        <w:keepNext w:val="1"/>
+        <w:keepLines w:val="1"/>
+        <w:spacing w:before="160" w:after="80"/>
+        <w:rPr>
+          <w:rFonts w:ascii="Aptos Display" w:hAnsi="Aptos Display" w:eastAsia="Aptos Display" w:cs="Aptos Display"/>
+          <w:b w:val="0"/>
+          <w:bCs w:val="0"/>
+          <w:i w:val="0"/>
+          <w:iCs w:val="0"/>
+          <w:caps w:val="0"/>
+          <w:smallCaps w:val="0"/>
+          <w:noProof w:val="0"/>
+          <w:color w:val="0F4761" w:themeColor="accent1" w:themeTint="FF" w:themeShade="BF"/>
+          <w:sz w:val="32"/>
+          <w:szCs w:val="32"/>
+          <w:lang w:val="en-US"/>
+        </w:rPr>
+      </w:pPr>
+      <w:r>
+        <w:rPr>
+          <w:rFonts w:ascii="Aptos Display" w:hAnsi="Aptos Display" w:eastAsia="Aptos Display" w:cs="Aptos Display"/>
+          <w:b w:val="0"/>
+          <w:bCs w:val="0"/>
+          <w:i w:val="0"/>
+          <w:iCs w:val="0"/>
+          <w:caps w:val="0"/>
+          <w:smallCaps w:val="0"/>
+          <w:noProof w:val="0"/>
+          <w:color w:val="0F4761" w:themeColor="accent1" w:themeTint="FF" w:themeShade="BF"/>
+          <w:sz w:val="32"/>
+          <w:szCs w:val="32"/>
+          <w:lang w:val="en-US"/>
+        </w:rPr>
+        <w:t>Team Gorvenance</w:t>
+      </w:r>
+    </w:p>
+    <w:p xmlns:wp14="http://schemas.microsoft.com/office/word/2010/wordml" wp14:paraId="44E8A9E5" wp14:textId="0596DB4F">
+      <w:pPr>
+        <w:rPr>
+          <w:rFonts w:ascii="Aptos" w:hAnsi="Aptos" w:eastAsia="Aptos" w:cs="Aptos"/>
+          <w:b w:val="0"/>
+          <w:bCs w:val="0"/>
+          <w:i w:val="0"/>
+          <w:iCs w:val="0"/>
+          <w:caps w:val="0"/>
+          <w:smallCaps w:val="0"/>
+          <w:noProof w:val="0"/>
+          <w:color w:val="000000" w:themeColor="text1" w:themeTint="FF" w:themeShade="FF"/>
+          <w:sz w:val="24"/>
+          <w:szCs w:val="24"/>
+          <w:lang w:val="en-US"/>
+        </w:rPr>
+      </w:pPr>
+      <w:r>
+        <w:rPr>
+          <w:rFonts w:ascii="Aptos" w:hAnsi="Aptos" w:eastAsia="Aptos" w:cs="Aptos"/>
+          <w:b w:val="0"/>
+          <w:bCs w:val="0"/>
+          <w:i w:val="0"/>
+          <w:iCs w:val="0"/>
+          <w:caps w:val="0"/>
+          <w:smallCaps w:val="0"/>
+          <w:noProof w:val="0"/>
+          <w:color w:val="000000" w:themeColor="text1" w:themeTint="FF" w:themeShade="FF"/>
+          <w:sz w:val="24"/>
+          <w:szCs w:val="24"/>
+          <w:lang w:val="en-US"/>
+        </w:rPr>
+        <w:t>The following will be done to ensure that at the end, a functional software product that meets the needs and requirements of the stakeholders:</w:t>
+      </w:r>
+    </w:p>
+    <w:p xmlns:wp14="http://schemas.microsoft.com/office/word/2010/wordml" wp14:paraId="41FF9AF3" wp14:textId="79E36FDB">
+      <w:pPr>
+        <w:pStyle w:val="ListParagraph"/>
+        <w:numPr>
+          <w:ilvl w:val="0"/>
+          <w:numId w:val="1"/>
+        </w:numPr>
+        <w:rPr>
+          <w:rFonts w:ascii="Aptos" w:hAnsi="Aptos" w:eastAsia="Aptos" w:cs="Aptos"/>
+          <w:b w:val="0"/>
+          <w:bCs w:val="0"/>
+          <w:i w:val="0"/>
+          <w:iCs w:val="0"/>
+          <w:caps w:val="0"/>
+          <w:smallCaps w:val="0"/>
+          <w:noProof w:val="0"/>
+          <w:color w:val="000000" w:themeColor="text1" w:themeTint="FF" w:themeShade="FF"/>
+          <w:sz w:val="24"/>
+          <w:szCs w:val="24"/>
+          <w:lang w:val="en-US"/>
+        </w:rPr>
+      </w:pPr>
+      <w:r>
+        <w:rPr>
+          <w:rFonts w:ascii="Aptos" w:hAnsi="Aptos" w:eastAsia="Aptos" w:cs="Aptos"/>
+          <w:b w:val="0"/>
+          <w:bCs w:val="0"/>
+          <w:i w:val="0"/>
+          <w:iCs w:val="0"/>
+          <w:caps w:val="0"/>
+          <w:smallCaps w:val="0"/>
+          <w:noProof w:val="0"/>
+          <w:color w:val="000000" w:themeColor="text1" w:themeTint="FF" w:themeShade="FF"/>
+          <w:sz w:val="24"/>
+          <w:szCs w:val="24"/>
+          <w:lang w:val="en-US"/>
+        </w:rPr>
+        <w:t>Using a protected main branch in the repository</w:t>
+      </w:r>
+    </w:p>
+    <w:p xmlns:wp14="http://schemas.microsoft.com/office/word/2010/wordml" wp14:paraId="22CEC659" wp14:textId="10E33B37">
+      <w:pPr>
+        <w:ind w:left="720"/>
+        <w:rPr>
+          <w:rFonts w:ascii="Aptos" w:hAnsi="Aptos" w:eastAsia="Aptos" w:cs="Aptos"/>
+          <w:b w:val="0"/>
+          <w:bCs w:val="0"/>
+          <w:i w:val="0"/>
+          <w:iCs w:val="0"/>
+          <w:caps w:val="0"/>
+          <w:smallCaps w:val="0"/>
+          <w:noProof w:val="0"/>
+          <w:color w:val="000000" w:themeColor="text1" w:themeTint="FF" w:themeShade="FF"/>
+          <w:sz w:val="24"/>
+          <w:szCs w:val="24"/>
+          <w:lang w:val="en-US"/>
+        </w:rPr>
+      </w:pPr>
+      <w:r>
+        <w:rPr>
+          <w:rFonts w:ascii="Aptos" w:hAnsi="Aptos" w:eastAsia="Aptos" w:cs="Aptos"/>
+          <w:b w:val="0"/>
+          <w:bCs w:val="0"/>
+          <w:i w:val="0"/>
+          <w:iCs w:val="0"/>
+          <w:caps w:val="0"/>
+          <w:smallCaps w:val="0"/>
+          <w:noProof w:val="0"/>
+          <w:color w:val="000000" w:themeColor="text1" w:themeTint="FF" w:themeShade="FF"/>
+          <w:sz w:val="24"/>
+          <w:szCs w:val="24"/>
+          <w:lang w:val="en-US"/>
+        </w:rPr>
+        <w:t xml:space="preserve">This will ensure that teams can work on their parts with full autonomy on separate branches and only commit work to the main branch after review. </w:t>
+      </w:r>
+    </w:p>
+    <w:p xmlns:wp14="http://schemas.microsoft.com/office/word/2010/wordml" wp14:paraId="642196F5" wp14:textId="2487FD11">
+      <w:pPr>
+        <w:pStyle w:val="ListParagraph"/>
+        <w:numPr>
+          <w:ilvl w:val="0"/>
+          <w:numId w:val="2"/>
+        </w:numPr>
+        <w:rPr>
+          <w:rFonts w:ascii="Aptos" w:hAnsi="Aptos" w:eastAsia="Aptos" w:cs="Aptos"/>
+          <w:b w:val="0"/>
+          <w:bCs w:val="0"/>
+          <w:i w:val="0"/>
+          <w:iCs w:val="0"/>
+          <w:caps w:val="0"/>
+          <w:smallCaps w:val="0"/>
+          <w:noProof w:val="0"/>
+          <w:color w:val="000000" w:themeColor="text1" w:themeTint="FF" w:themeShade="FF"/>
+          <w:sz w:val="24"/>
+          <w:szCs w:val="24"/>
+          <w:lang w:val="en-US"/>
+        </w:rPr>
+      </w:pPr>
+      <w:r>
+        <w:rPr>
+          <w:rFonts w:ascii="Aptos" w:hAnsi="Aptos" w:eastAsia="Aptos" w:cs="Aptos"/>
+          <w:b w:val="0"/>
+          <w:bCs w:val="0"/>
+          <w:i w:val="0"/>
+          <w:iCs w:val="0"/>
+          <w:caps w:val="0"/>
+          <w:smallCaps w:val="0"/>
+          <w:noProof w:val="0"/>
+          <w:color w:val="000000" w:themeColor="text1" w:themeTint="FF" w:themeShade="FF"/>
+          <w:sz w:val="24"/>
+          <w:szCs w:val="24"/>
+          <w:lang w:val="en-US"/>
+        </w:rPr>
+        <w:t>Two collaborators out of the three will have to approve any changes that will have to be merged to our main branch.</w:t>
+      </w:r>
+    </w:p>
+    <w:p xmlns:wp14="http://schemas.microsoft.com/office/word/2010/wordml" wp14:paraId="3AE5926E" wp14:textId="0D4A69C7">
+      <w:pPr>
+        <w:pStyle w:val="ListParagraph"/>
+        <w:numPr>
+          <w:ilvl w:val="0"/>
+          <w:numId w:val="2"/>
+        </w:numPr>
+        <w:rPr>
+          <w:rFonts w:ascii="Aptos" w:hAnsi="Aptos" w:eastAsia="Aptos" w:cs="Aptos"/>
+          <w:b w:val="0"/>
+          <w:bCs w:val="0"/>
+          <w:i w:val="0"/>
+          <w:iCs w:val="0"/>
+          <w:caps w:val="0"/>
+          <w:smallCaps w:val="0"/>
+          <w:noProof w:val="0"/>
+          <w:color w:val="000000" w:themeColor="text1" w:themeTint="FF" w:themeShade="FF"/>
+          <w:sz w:val="24"/>
+          <w:szCs w:val="24"/>
+          <w:lang w:val="en-US"/>
+        </w:rPr>
+      </w:pPr>
+      <w:r>
+        <w:rPr>
+          <w:rFonts w:ascii="Aptos" w:hAnsi="Aptos" w:eastAsia="Aptos" w:cs="Aptos"/>
+          <w:b w:val="0"/>
+          <w:bCs w:val="0"/>
+          <w:i w:val="0"/>
+          <w:iCs w:val="0"/>
+          <w:caps w:val="0"/>
+          <w:smallCaps w:val="0"/>
+          <w:noProof w:val="0"/>
+          <w:color w:val="000000" w:themeColor="text1" w:themeTint="FF" w:themeShade="FF"/>
+          <w:sz w:val="24"/>
+          <w:szCs w:val="24"/>
+          <w:lang w:val="en-US"/>
+        </w:rPr>
+        <w:t>Pull requests with detailed descriptions, branches, and commits will be used throughout the project.</w:t>
+      </w:r>
+    </w:p>
+    <w:p xmlns:wp14="http://schemas.microsoft.com/office/word/2010/wordml" wp14:paraId="32102924" wp14:textId="5D4ECF10">
+      <w:pPr>
+        <w:pStyle w:val="Heading2"/>
+        <w:keepNext w:val="1"/>
+        <w:keepLines w:val="1"/>
+        <w:spacing w:before="160" w:after="80"/>
+        <w:rPr>
+          <w:rFonts w:ascii="Aptos Display" w:hAnsi="Aptos Display" w:eastAsia="Aptos Display" w:cs="Aptos Display"/>
+          <w:b w:val="0"/>
+          <w:bCs w:val="0"/>
+          <w:i w:val="0"/>
+          <w:iCs w:val="0"/>
+          <w:caps w:val="0"/>
+          <w:smallCaps w:val="0"/>
+          <w:noProof w:val="0"/>
+          <w:color w:val="0F4761" w:themeColor="accent1" w:themeTint="FF" w:themeShade="BF"/>
+          <w:sz w:val="32"/>
+          <w:szCs w:val="32"/>
+          <w:lang w:val="en-US"/>
+        </w:rPr>
+      </w:pPr>
+      <w:r>
+        <w:rPr>
+          <w:rFonts w:ascii="Aptos Display" w:hAnsi="Aptos Display" w:eastAsia="Aptos Display" w:cs="Aptos Display"/>
+          <w:b w:val="0"/>
+          <w:bCs w:val="0"/>
+          <w:i w:val="0"/>
+          <w:iCs w:val="0"/>
+          <w:caps w:val="0"/>
+          <w:smallCaps w:val="0"/>
+          <w:noProof w:val="0"/>
+          <w:color w:val="0F4761" w:themeColor="accent1" w:themeTint="FF" w:themeShade="BF"/>
+          <w:sz w:val="32"/>
+          <w:szCs w:val="32"/>
+          <w:lang w:val="en-US"/>
+        </w:rPr>
+        <w:t>AI Compliance and controls</w:t>
+      </w:r>
+    </w:p>
+    <w:p xmlns:wp14="http://schemas.microsoft.com/office/word/2010/wordml" wp14:paraId="530324F0" wp14:textId="299DF82C">
+      <w:pPr>
+        <w:rPr>
+          <w:rFonts w:ascii="Aptos" w:hAnsi="Aptos" w:eastAsia="Aptos" w:cs="Aptos"/>
+          <w:b w:val="0"/>
+          <w:bCs w:val="0"/>
+          <w:i w:val="0"/>
+          <w:iCs w:val="0"/>
+          <w:caps w:val="0"/>
+          <w:smallCaps w:val="0"/>
+          <w:noProof w:val="0"/>
+          <w:color w:val="000000" w:themeColor="text1" w:themeTint="FF" w:themeShade="FF"/>
+          <w:sz w:val="24"/>
+          <w:szCs w:val="24"/>
+          <w:lang w:val="en-US"/>
+        </w:rPr>
+      </w:pPr>
+      <w:r>
+        <w:rPr>
+          <w:rFonts w:ascii="Aptos" w:hAnsi="Aptos" w:eastAsia="Aptos" w:cs="Aptos"/>
+          <w:b w:val="0"/>
+          <w:bCs w:val="0"/>
+          <w:i w:val="0"/>
+          <w:iCs w:val="0"/>
+          <w:caps w:val="0"/>
+          <w:smallCaps w:val="0"/>
+          <w:noProof w:val="0"/>
+          <w:color w:val="000000" w:themeColor="text1" w:themeTint="FF" w:themeShade="FF"/>
+          <w:sz w:val="24"/>
+          <w:szCs w:val="24"/>
+          <w:lang w:val="en-US"/>
+        </w:rPr>
+        <w:t xml:space="preserve">AI compliance refers to ensuring that AI used adheres to the legal and ethical standards (McGrath and Jonker, 2024). It is also about making sure that any decision taken with the assistance of AI is well-informed and it goes through human review to maintain transparency and trust between the team and the stakeholders (McGrath and Jonker, 2024). For the AI compliance part of our project, we will focus on the following:  </w:t>
+      </w:r>
+    </w:p>
+    <w:p xmlns:wp14="http://schemas.microsoft.com/office/word/2010/wordml" wp14:paraId="0C3BEACA" wp14:textId="28E4455F">
+      <w:pPr>
+        <w:pStyle w:val="ListParagraph"/>
+        <w:numPr>
+          <w:ilvl w:val="0"/>
+          <w:numId w:val="3"/>
+        </w:numPr>
+        <w:rPr>
+          <w:rFonts w:ascii="Aptos" w:hAnsi="Aptos" w:eastAsia="Aptos" w:cs="Aptos"/>
+          <w:b w:val="0"/>
+          <w:bCs w:val="0"/>
+          <w:i w:val="0"/>
+          <w:iCs w:val="0"/>
+          <w:caps w:val="0"/>
+          <w:smallCaps w:val="0"/>
+          <w:noProof w:val="0"/>
+          <w:color w:val="000000" w:themeColor="text1" w:themeTint="FF" w:themeShade="FF"/>
+          <w:sz w:val="24"/>
+          <w:szCs w:val="24"/>
+          <w:lang w:val="en-US"/>
+        </w:rPr>
+      </w:pPr>
+      <w:r>
+        <w:rPr>
+          <w:rFonts w:ascii="Aptos" w:hAnsi="Aptos" w:eastAsia="Aptos" w:cs="Aptos"/>
+          <w:b w:val="1"/>
+          <w:bCs w:val="1"/>
+          <w:i w:val="0"/>
+          <w:iCs w:val="0"/>
+          <w:caps w:val="0"/>
+          <w:smallCaps w:val="0"/>
+          <w:noProof w:val="0"/>
+          <w:color w:val="000000" w:themeColor="text1" w:themeTint="FF" w:themeShade="FF"/>
+          <w:sz w:val="24"/>
+          <w:szCs w:val="24"/>
+          <w:lang w:val="en-US"/>
+        </w:rPr>
+        <w:t>Planning</w:t>
+      </w:r>
+    </w:p>
+    <w:p xmlns:wp14="http://schemas.microsoft.com/office/word/2010/wordml" wp14:paraId="786FBD46" wp14:textId="5FF7092E">
+      <w:pPr>
+        <w:ind w:left="720"/>
+        <w:rPr>
+          <w:rFonts w:ascii="Aptos" w:hAnsi="Aptos" w:eastAsia="Aptos" w:cs="Aptos"/>
+          <w:b w:val="0"/>
+          <w:bCs w:val="0"/>
+          <w:i w:val="0"/>
+          <w:iCs w:val="0"/>
+          <w:caps w:val="0"/>
+          <w:smallCaps w:val="0"/>
+          <w:noProof w:val="0"/>
+          <w:color w:val="000000" w:themeColor="text1" w:themeTint="FF" w:themeShade="FF"/>
+          <w:sz w:val="24"/>
+          <w:szCs w:val="24"/>
+          <w:lang w:val="en-US"/>
+        </w:rPr>
+      </w:pPr>
+      <w:r>
+        <w:rPr>
+          <w:rFonts w:ascii="Aptos" w:hAnsi="Aptos" w:eastAsia="Aptos" w:cs="Aptos"/>
+          <w:b w:val="0"/>
+          <w:bCs w:val="0"/>
+          <w:i w:val="0"/>
+          <w:iCs w:val="0"/>
+          <w:caps w:val="0"/>
+          <w:smallCaps w:val="0"/>
+          <w:noProof w:val="0"/>
+          <w:color w:val="000000" w:themeColor="text1" w:themeTint="FF" w:themeShade="FF"/>
+          <w:sz w:val="24"/>
+          <w:szCs w:val="24"/>
+          <w:lang w:val="en-US"/>
+        </w:rPr>
+        <w:t>Before using any AI assisted coding tools, the focus will be on planning the architecture, testing plans, and integration points of the project first (Sreejith Sreejayan, 2025). Then a plan on how to handle AI generated output will be handled.</w:t>
+      </w:r>
+    </w:p>
+    <w:p xmlns:wp14="http://schemas.microsoft.com/office/word/2010/wordml" wp14:paraId="76F78C0B" wp14:textId="4E491EE5">
+      <w:pPr>
+        <w:pStyle w:val="ListParagraph"/>
+        <w:numPr>
+          <w:ilvl w:val="0"/>
+          <w:numId w:val="4"/>
+        </w:numPr>
+        <w:rPr>
+          <w:rFonts w:ascii="Aptos" w:hAnsi="Aptos" w:eastAsia="Aptos" w:cs="Aptos"/>
+          <w:b w:val="0"/>
+          <w:bCs w:val="0"/>
+          <w:i w:val="0"/>
+          <w:iCs w:val="0"/>
+          <w:caps w:val="0"/>
+          <w:smallCaps w:val="0"/>
+          <w:noProof w:val="0"/>
+          <w:color w:val="000000" w:themeColor="text1" w:themeTint="FF" w:themeShade="FF"/>
+          <w:sz w:val="24"/>
+          <w:szCs w:val="24"/>
+          <w:lang w:val="en-US"/>
+        </w:rPr>
+      </w:pPr>
+      <w:r>
+        <w:rPr>
+          <w:rFonts w:ascii="Aptos" w:hAnsi="Aptos" w:eastAsia="Aptos" w:cs="Aptos"/>
+          <w:b w:val="1"/>
+          <w:bCs w:val="1"/>
+          <w:i w:val="0"/>
+          <w:iCs w:val="0"/>
+          <w:caps w:val="0"/>
+          <w:smallCaps w:val="0"/>
+          <w:noProof w:val="0"/>
+          <w:color w:val="000000" w:themeColor="text1" w:themeTint="FF" w:themeShade="FF"/>
+          <w:sz w:val="24"/>
+          <w:szCs w:val="24"/>
+          <w:lang w:val="en-US"/>
+        </w:rPr>
+        <w:t>Considering constraints during development</w:t>
+      </w:r>
+    </w:p>
+    <w:p xmlns:wp14="http://schemas.microsoft.com/office/word/2010/wordml" wp14:paraId="3F69CB8C" wp14:textId="141099C0">
+      <w:pPr>
+        <w:ind w:left="720"/>
+        <w:rPr>
+          <w:rFonts w:ascii="Aptos" w:hAnsi="Aptos" w:eastAsia="Aptos" w:cs="Aptos"/>
+          <w:b w:val="0"/>
+          <w:bCs w:val="0"/>
+          <w:i w:val="0"/>
+          <w:iCs w:val="0"/>
+          <w:caps w:val="0"/>
+          <w:smallCaps w:val="0"/>
+          <w:noProof w:val="0"/>
+          <w:color w:val="000000" w:themeColor="text1" w:themeTint="FF" w:themeShade="FF"/>
+          <w:sz w:val="24"/>
+          <w:szCs w:val="24"/>
+          <w:lang w:val="en-US"/>
+        </w:rPr>
+      </w:pPr>
+      <w:r>
+        <w:rPr>
+          <w:rFonts w:ascii="Aptos" w:hAnsi="Aptos" w:eastAsia="Aptos" w:cs="Aptos"/>
+          <w:b w:val="0"/>
+          <w:bCs w:val="0"/>
+          <w:i w:val="0"/>
+          <w:iCs w:val="0"/>
+          <w:caps w:val="0"/>
+          <w:smallCaps w:val="0"/>
+          <w:noProof w:val="0"/>
+          <w:color w:val="000000" w:themeColor="text1" w:themeTint="FF" w:themeShade="FF"/>
+          <w:sz w:val="24"/>
+          <w:szCs w:val="24"/>
+          <w:lang w:val="en-US"/>
+        </w:rPr>
+        <w:t>Instead of just sending prompts to AI models, during development, constraints will be sent to the AI models to assist in building individual modules to prevent multiple errors caused by prompting AI to code everything (Sreejith Sreejayan, 2025).</w:t>
+      </w:r>
+    </w:p>
+    <w:p xmlns:wp14="http://schemas.microsoft.com/office/word/2010/wordml" wp14:paraId="35ACE795" wp14:textId="7319CCD0">
+      <w:pPr>
+        <w:pStyle w:val="ListParagraph"/>
+        <w:numPr>
+          <w:ilvl w:val="0"/>
+          <w:numId w:val="5"/>
+        </w:numPr>
+        <w:rPr>
+          <w:rFonts w:ascii="Aptos" w:hAnsi="Aptos" w:eastAsia="Aptos" w:cs="Aptos"/>
+          <w:b w:val="0"/>
+          <w:bCs w:val="0"/>
+          <w:i w:val="0"/>
+          <w:iCs w:val="0"/>
+          <w:caps w:val="0"/>
+          <w:smallCaps w:val="0"/>
+          <w:noProof w:val="0"/>
+          <w:color w:val="000000" w:themeColor="text1" w:themeTint="FF" w:themeShade="FF"/>
+          <w:sz w:val="24"/>
+          <w:szCs w:val="24"/>
+          <w:lang w:val="en-US"/>
+        </w:rPr>
+      </w:pPr>
+      <w:r>
+        <w:rPr>
+          <w:rFonts w:ascii="Aptos" w:hAnsi="Aptos" w:eastAsia="Aptos" w:cs="Aptos"/>
+          <w:b w:val="1"/>
+          <w:bCs w:val="1"/>
+          <w:i w:val="0"/>
+          <w:iCs w:val="0"/>
+          <w:caps w:val="0"/>
+          <w:smallCaps w:val="0"/>
+          <w:noProof w:val="0"/>
+          <w:color w:val="000000" w:themeColor="text1" w:themeTint="FF" w:themeShade="FF"/>
+          <w:sz w:val="24"/>
+          <w:szCs w:val="24"/>
+          <w:lang w:val="en-US"/>
+        </w:rPr>
+        <w:t>Prioritizing the understanding of the functionality of the code</w:t>
+      </w:r>
+    </w:p>
+    <w:p xmlns:wp14="http://schemas.microsoft.com/office/word/2010/wordml" wp14:paraId="09497E86" wp14:textId="6B3FF763">
+      <w:pPr>
+        <w:ind w:left="720"/>
+        <w:rPr>
+          <w:rFonts w:ascii="Aptos" w:hAnsi="Aptos" w:eastAsia="Aptos" w:cs="Aptos"/>
+          <w:b w:val="0"/>
+          <w:bCs w:val="0"/>
+          <w:i w:val="0"/>
+          <w:iCs w:val="0"/>
+          <w:caps w:val="0"/>
+          <w:smallCaps w:val="0"/>
+          <w:noProof w:val="0"/>
+          <w:color w:val="000000" w:themeColor="text1" w:themeTint="FF" w:themeShade="FF"/>
+          <w:sz w:val="24"/>
+          <w:szCs w:val="24"/>
+          <w:lang w:val="en-US"/>
+        </w:rPr>
+      </w:pPr>
+      <w:r>
+        <w:rPr>
+          <w:rFonts w:ascii="Aptos" w:hAnsi="Aptos" w:eastAsia="Aptos" w:cs="Aptos"/>
+          <w:b w:val="0"/>
+          <w:bCs w:val="0"/>
+          <w:i w:val="0"/>
+          <w:iCs w:val="0"/>
+          <w:caps w:val="0"/>
+          <w:smallCaps w:val="0"/>
+          <w:noProof w:val="0"/>
+          <w:color w:val="000000" w:themeColor="text1" w:themeTint="FF" w:themeShade="FF"/>
+          <w:sz w:val="24"/>
+          <w:szCs w:val="24"/>
+          <w:lang w:val="en-US"/>
+        </w:rPr>
+        <w:t>The team will focus on understanding the implementation of the code, the data flow in the system, and how to debug code when there might be a requirement change (Sreejith Sreejayan, 2025).</w:t>
+      </w:r>
+    </w:p>
+    <w:p xmlns:wp14="http://schemas.microsoft.com/office/word/2010/wordml" wp14:paraId="6C785953" wp14:textId="4B388BE9">
+      <w:pPr>
+        <w:pStyle w:val="ListParagraph"/>
+        <w:numPr>
+          <w:ilvl w:val="0"/>
+          <w:numId w:val="5"/>
+        </w:numPr>
+        <w:rPr>
+          <w:rFonts w:ascii="Aptos" w:hAnsi="Aptos" w:eastAsia="Aptos" w:cs="Aptos"/>
+          <w:b w:val="0"/>
+          <w:bCs w:val="0"/>
+          <w:i w:val="0"/>
+          <w:iCs w:val="0"/>
+          <w:caps w:val="0"/>
+          <w:smallCaps w:val="0"/>
+          <w:noProof w:val="0"/>
+          <w:color w:val="000000" w:themeColor="text1" w:themeTint="FF" w:themeShade="FF"/>
+          <w:sz w:val="24"/>
+          <w:szCs w:val="24"/>
+          <w:lang w:val="en-US"/>
+        </w:rPr>
+      </w:pPr>
+      <w:r>
+        <w:rPr>
+          <w:rFonts w:ascii="Aptos" w:hAnsi="Aptos" w:eastAsia="Aptos" w:cs="Aptos"/>
+          <w:b w:val="1"/>
+          <w:bCs w:val="1"/>
+          <w:i w:val="0"/>
+          <w:iCs w:val="0"/>
+          <w:caps w:val="0"/>
+          <w:smallCaps w:val="0"/>
+          <w:noProof w:val="0"/>
+          <w:color w:val="000000" w:themeColor="text1" w:themeTint="FF" w:themeShade="FF"/>
+          <w:sz w:val="24"/>
+          <w:szCs w:val="24"/>
+          <w:lang w:val="en-US"/>
+        </w:rPr>
+        <w:t>Security focused AI assisted development</w:t>
+      </w:r>
+    </w:p>
+    <w:p xmlns:wp14="http://schemas.microsoft.com/office/word/2010/wordml" wp14:paraId="26443959" wp14:textId="6F0F483B">
+      <w:pPr>
+        <w:ind w:left="720"/>
+        <w:rPr>
+          <w:rFonts w:ascii="Aptos" w:hAnsi="Aptos" w:eastAsia="Aptos" w:cs="Aptos"/>
+          <w:b w:val="0"/>
+          <w:bCs w:val="0"/>
+          <w:i w:val="0"/>
+          <w:iCs w:val="0"/>
+          <w:caps w:val="0"/>
+          <w:smallCaps w:val="0"/>
+          <w:noProof w:val="0"/>
+          <w:color w:val="000000" w:themeColor="text1" w:themeTint="FF" w:themeShade="FF"/>
+          <w:sz w:val="24"/>
+          <w:szCs w:val="24"/>
+          <w:lang w:val="en-US"/>
+        </w:rPr>
+      </w:pPr>
+      <w:r>
+        <w:rPr>
+          <w:rFonts w:ascii="Aptos" w:hAnsi="Aptos" w:eastAsia="Aptos" w:cs="Aptos"/>
+          <w:b w:val="0"/>
+          <w:bCs w:val="0"/>
+          <w:i w:val="0"/>
+          <w:iCs w:val="0"/>
+          <w:caps w:val="0"/>
+          <w:smallCaps w:val="0"/>
+          <w:noProof w:val="0"/>
+          <w:color w:val="000000" w:themeColor="text1" w:themeTint="FF" w:themeShade="FF"/>
+          <w:sz w:val="24"/>
+          <w:szCs w:val="24"/>
+          <w:lang w:val="en-US"/>
+        </w:rPr>
+        <w:t>All AI code must be treated as potentially malicious as up to 35.8% of AI generated code can cause security weaknesses in software systems (Sreejith Sreejayan, 2025). As a precaution the following rules will be followed when developing the software system:</w:t>
+      </w:r>
+    </w:p>
+    <w:p xmlns:wp14="http://schemas.microsoft.com/office/word/2010/wordml" wp14:paraId="27EF6ADE" wp14:textId="5FA0F026">
+      <w:pPr>
+        <w:pStyle w:val="ListParagraph"/>
+        <w:numPr>
+          <w:ilvl w:val="0"/>
+          <w:numId w:val="6"/>
+        </w:numPr>
+        <w:rPr>
+          <w:rFonts w:ascii="Aptos" w:hAnsi="Aptos" w:eastAsia="Aptos" w:cs="Aptos"/>
+          <w:b w:val="0"/>
+          <w:bCs w:val="0"/>
+          <w:i w:val="0"/>
+          <w:iCs w:val="0"/>
+          <w:caps w:val="0"/>
+          <w:smallCaps w:val="0"/>
+          <w:noProof w:val="0"/>
+          <w:color w:val="000000" w:themeColor="text1" w:themeTint="FF" w:themeShade="FF"/>
+          <w:sz w:val="24"/>
+          <w:szCs w:val="24"/>
+          <w:lang w:val="en-US"/>
+        </w:rPr>
+      </w:pPr>
+      <w:r>
+        <w:rPr>
+          <w:rFonts w:ascii="Aptos" w:hAnsi="Aptos" w:eastAsia="Aptos" w:cs="Aptos"/>
+          <w:b w:val="0"/>
+          <w:bCs w:val="0"/>
+          <w:i w:val="0"/>
+          <w:iCs w:val="0"/>
+          <w:caps w:val="0"/>
+          <w:smallCaps w:val="0"/>
+          <w:noProof w:val="0"/>
+          <w:color w:val="000000" w:themeColor="text1" w:themeTint="FF" w:themeShade="FF"/>
+          <w:sz w:val="24"/>
+          <w:szCs w:val="24"/>
+          <w:lang w:val="en-US"/>
+        </w:rPr>
+        <w:t>API keys or any sensitive information should not be added into any AI prompts.</w:t>
+      </w:r>
+    </w:p>
+    <w:p xmlns:wp14="http://schemas.microsoft.com/office/word/2010/wordml" wp14:paraId="32D66702" wp14:textId="7298706F">
+      <w:pPr>
+        <w:pStyle w:val="ListParagraph"/>
+        <w:numPr>
+          <w:ilvl w:val="0"/>
+          <w:numId w:val="6"/>
+        </w:numPr>
+        <w:rPr>
+          <w:rFonts w:ascii="Aptos" w:hAnsi="Aptos" w:eastAsia="Aptos" w:cs="Aptos"/>
+          <w:b w:val="0"/>
+          <w:bCs w:val="0"/>
+          <w:i w:val="0"/>
+          <w:iCs w:val="0"/>
+          <w:caps w:val="0"/>
+          <w:smallCaps w:val="0"/>
+          <w:noProof w:val="0"/>
+          <w:color w:val="000000" w:themeColor="text1" w:themeTint="FF" w:themeShade="FF"/>
+          <w:sz w:val="24"/>
+          <w:szCs w:val="24"/>
+          <w:lang w:val="en-US"/>
+        </w:rPr>
+      </w:pPr>
+      <w:r>
+        <w:rPr>
+          <w:rFonts w:ascii="Aptos" w:hAnsi="Aptos" w:eastAsia="Aptos" w:cs="Aptos"/>
+          <w:b w:val="0"/>
+          <w:bCs w:val="0"/>
+          <w:i w:val="0"/>
+          <w:iCs w:val="0"/>
+          <w:caps w:val="0"/>
+          <w:smallCaps w:val="0"/>
+          <w:noProof w:val="0"/>
+          <w:color w:val="000000" w:themeColor="text1" w:themeTint="FF" w:themeShade="FF"/>
+          <w:sz w:val="24"/>
+          <w:szCs w:val="24"/>
+          <w:lang w:val="en-US"/>
+        </w:rPr>
+        <w:t>Placeholder values should be used in prompts instead of using real values.</w:t>
+      </w:r>
+    </w:p>
+    <w:p xmlns:wp14="http://schemas.microsoft.com/office/word/2010/wordml" wp14:paraId="3D19F5C9" wp14:textId="6155F8A2">
+      <w:pPr>
+        <w:pStyle w:val="ListParagraph"/>
+        <w:numPr>
+          <w:ilvl w:val="0"/>
+          <w:numId w:val="6"/>
+        </w:numPr>
+        <w:rPr>
+          <w:rFonts w:ascii="Aptos" w:hAnsi="Aptos" w:eastAsia="Aptos" w:cs="Aptos"/>
+          <w:b w:val="0"/>
+          <w:bCs w:val="0"/>
+          <w:i w:val="0"/>
+          <w:iCs w:val="0"/>
+          <w:caps w:val="0"/>
+          <w:smallCaps w:val="0"/>
+          <w:noProof w:val="0"/>
+          <w:color w:val="000000" w:themeColor="text1" w:themeTint="FF" w:themeShade="FF"/>
+          <w:sz w:val="24"/>
+          <w:szCs w:val="24"/>
+          <w:lang w:val="en-US"/>
+        </w:rPr>
+      </w:pPr>
+      <w:r>
+        <w:rPr>
+          <w:rFonts w:ascii="Aptos" w:hAnsi="Aptos" w:eastAsia="Aptos" w:cs="Aptos"/>
+          <w:b w:val="0"/>
+          <w:bCs w:val="0"/>
+          <w:i w:val="0"/>
+          <w:iCs w:val="0"/>
+          <w:caps w:val="0"/>
+          <w:smallCaps w:val="0"/>
+          <w:noProof w:val="0"/>
+          <w:color w:val="000000" w:themeColor="text1" w:themeTint="FF" w:themeShade="FF"/>
+          <w:sz w:val="24"/>
+          <w:szCs w:val="24"/>
+          <w:lang w:val="en-US"/>
+        </w:rPr>
+        <w:t>AI generated code should not be deployed without human review.</w:t>
+      </w:r>
+    </w:p>
+    <w:p xmlns:wp14="http://schemas.microsoft.com/office/word/2010/wordml" wp14:paraId="39603148" wp14:textId="1E7E7BBD">
+      <w:pPr>
+        <w:pStyle w:val="ListParagraph"/>
+        <w:numPr>
+          <w:ilvl w:val="0"/>
+          <w:numId w:val="7"/>
+        </w:numPr>
+        <w:rPr>
+          <w:rFonts w:ascii="Aptos" w:hAnsi="Aptos" w:eastAsia="Aptos" w:cs="Aptos"/>
+          <w:b w:val="0"/>
+          <w:bCs w:val="0"/>
+          <w:i w:val="0"/>
+          <w:iCs w:val="0"/>
+          <w:caps w:val="0"/>
+          <w:smallCaps w:val="0"/>
+          <w:noProof w:val="0"/>
+          <w:color w:val="000000" w:themeColor="text1" w:themeTint="FF" w:themeShade="FF"/>
+          <w:sz w:val="24"/>
+          <w:szCs w:val="24"/>
+          <w:lang w:val="en-US"/>
+        </w:rPr>
+      </w:pPr>
+      <w:r>
+        <w:rPr>
+          <w:rFonts w:ascii="Aptos" w:hAnsi="Aptos" w:eastAsia="Aptos" w:cs="Aptos"/>
+          <w:b w:val="1"/>
+          <w:bCs w:val="1"/>
+          <w:i w:val="0"/>
+          <w:iCs w:val="0"/>
+          <w:caps w:val="0"/>
+          <w:smallCaps w:val="0"/>
+          <w:noProof w:val="0"/>
+          <w:color w:val="000000" w:themeColor="text1" w:themeTint="FF" w:themeShade="FF"/>
+          <w:sz w:val="24"/>
+          <w:szCs w:val="24"/>
+          <w:lang w:val="en-US"/>
+        </w:rPr>
+        <w:t>AI usage register</w:t>
+      </w:r>
+    </w:p>
+    <w:p xmlns:wp14="http://schemas.microsoft.com/office/word/2010/wordml" wp14:paraId="04EA78CC" wp14:textId="1EDB50E4">
+      <w:pPr>
+        <w:ind w:left="720"/>
+        <w:rPr>
+          <w:rFonts w:ascii="Aptos" w:hAnsi="Aptos" w:eastAsia="Aptos" w:cs="Aptos"/>
+          <w:b w:val="0"/>
+          <w:bCs w:val="0"/>
+          <w:i w:val="0"/>
+          <w:iCs w:val="0"/>
+          <w:caps w:val="0"/>
+          <w:smallCaps w:val="0"/>
+          <w:noProof w:val="0"/>
+          <w:color w:val="000000" w:themeColor="text1" w:themeTint="FF" w:themeShade="FF"/>
+          <w:sz w:val="24"/>
+          <w:szCs w:val="24"/>
+          <w:lang w:val="en-US"/>
+        </w:rPr>
+      </w:pPr>
+      <w:r>
+        <w:rPr>
+          <w:rFonts w:ascii="Aptos" w:hAnsi="Aptos" w:eastAsia="Aptos" w:cs="Aptos"/>
+          <w:b w:val="0"/>
+          <w:bCs w:val="0"/>
+          <w:i w:val="0"/>
+          <w:iCs w:val="0"/>
+          <w:caps w:val="0"/>
+          <w:smallCaps w:val="0"/>
+          <w:noProof w:val="0"/>
+          <w:color w:val="000000" w:themeColor="text1" w:themeTint="FF" w:themeShade="FF"/>
+          <w:sz w:val="24"/>
+          <w:szCs w:val="24"/>
+          <w:lang w:val="en-US"/>
+        </w:rPr>
+        <w:t>Throughout the project, we will be using an AI usage register to document all the AI outputs that will be used in the project. This will include a unique ID for each output, its source, purpose, owner, and risk.</w:t>
+      </w:r>
+    </w:p>
+    <w:p xmlns:wp14="http://schemas.microsoft.com/office/word/2010/wordml" wp14:paraId="74C213E3" wp14:textId="2A526E7B">
+      <w:pPr>
+        <w:pStyle w:val="Heading2"/>
+        <w:keepNext w:val="1"/>
+        <w:keepLines w:val="1"/>
+        <w:spacing w:before="160" w:after="80"/>
+        <w:rPr>
+          <w:rFonts w:ascii="Aptos Display" w:hAnsi="Aptos Display" w:eastAsia="Aptos Display" w:cs="Aptos Display"/>
+          <w:b w:val="0"/>
+          <w:bCs w:val="0"/>
+          <w:i w:val="0"/>
+          <w:iCs w:val="0"/>
+          <w:caps w:val="0"/>
+          <w:smallCaps w:val="0"/>
+          <w:noProof w:val="0"/>
+          <w:color w:val="0F4761" w:themeColor="accent1" w:themeTint="FF" w:themeShade="BF"/>
+          <w:sz w:val="32"/>
+          <w:szCs w:val="32"/>
+          <w:lang w:val="en-US"/>
+        </w:rPr>
+      </w:pPr>
+      <w:r>
+        <w:rPr>
+          <w:rFonts w:ascii="Aptos Display" w:hAnsi="Aptos Display" w:eastAsia="Aptos Display" w:cs="Aptos Display"/>
+          <w:b w:val="0"/>
+          <w:bCs w:val="0"/>
+          <w:i w:val="0"/>
+          <w:iCs w:val="0"/>
+          <w:caps w:val="0"/>
+          <w:smallCaps w:val="0"/>
+          <w:noProof w:val="0"/>
+          <w:color w:val="0F4761" w:themeColor="accent1" w:themeTint="FF" w:themeShade="BF"/>
+          <w:sz w:val="32"/>
+          <w:szCs w:val="32"/>
+          <w:lang w:val="en-US"/>
+        </w:rPr>
+        <w:t>Conclusion</w:t>
+      </w:r>
+    </w:p>
+    <w:p xmlns:wp14="http://schemas.microsoft.com/office/word/2010/wordml" wp14:paraId="28FF3EFA" wp14:textId="790EF41D">
+      <w:pPr>
+        <w:rPr>
+          <w:rFonts w:ascii="Aptos" w:hAnsi="Aptos" w:eastAsia="Aptos" w:cs="Aptos"/>
+          <w:b w:val="0"/>
+          <w:bCs w:val="0"/>
+          <w:i w:val="0"/>
+          <w:iCs w:val="0"/>
+          <w:caps w:val="0"/>
+          <w:smallCaps w:val="0"/>
+          <w:noProof w:val="0"/>
+          <w:color w:val="000000" w:themeColor="text1" w:themeTint="FF" w:themeShade="FF"/>
+          <w:sz w:val="24"/>
+          <w:szCs w:val="24"/>
+          <w:lang w:val="en-US"/>
+        </w:rPr>
+      </w:pPr>
+      <w:r>
+        <w:rPr>
+          <w:rFonts w:ascii="Aptos" w:hAnsi="Aptos" w:eastAsia="Aptos" w:cs="Aptos"/>
+          <w:b w:val="0"/>
+          <w:bCs w:val="0"/>
+          <w:i w:val="0"/>
+          <w:iCs w:val="0"/>
+          <w:caps w:val="0"/>
+          <w:smallCaps w:val="0"/>
+          <w:noProof w:val="0"/>
+          <w:color w:val="000000" w:themeColor="text1" w:themeTint="FF" w:themeShade="FF"/>
+          <w:sz w:val="24"/>
+          <w:szCs w:val="24"/>
+          <w:lang w:val="en-US"/>
+        </w:rPr>
+        <w:t>By enforcing the following branch protection rules, review approval rules, and structure for pull requests and commits, accountability and transparency throughout the project will be maintained. These rules along with AI compliance will ensure that AI tools will be used to further improve the project and to prevent any defects in the software project. These will ensure that the integrity of the software project in this milestone through to the last milestone.</w:t>
+      </w:r>
+    </w:p>
+    <w:p xmlns:wp14="http://schemas.microsoft.com/office/word/2010/wordml" wp14:paraId="4663380E" wp14:textId="59D967C6">
+      <w:pPr>
+        <w:rPr>
+          <w:rFonts w:ascii="Aptos" w:hAnsi="Aptos" w:eastAsia="Aptos" w:cs="Aptos"/>
+          <w:b w:val="0"/>
+          <w:bCs w:val="0"/>
+          <w:i w:val="0"/>
+          <w:iCs w:val="0"/>
+          <w:caps w:val="0"/>
+          <w:smallCaps w:val="0"/>
+          <w:noProof w:val="0"/>
+          <w:color w:val="000000" w:themeColor="text1" w:themeTint="FF" w:themeShade="FF"/>
+          <w:sz w:val="24"/>
+          <w:szCs w:val="24"/>
+          <w:lang w:val="en-US"/>
+        </w:rPr>
+      </w:pPr>
+    </w:p>
+    <w:p xmlns:wp14="http://schemas.microsoft.com/office/word/2010/wordml" wp14:paraId="16C73ED7" wp14:textId="3C39FC1B">
+      <w:pPr>
+        <w:pStyle w:val="Heading1"/>
+        <w:keepNext w:val="1"/>
+        <w:keepLines w:val="1"/>
+        <w:spacing w:before="360" w:after="80"/>
+        <w:rPr>
+          <w:rFonts w:ascii="Aptos Display" w:hAnsi="Aptos Display" w:eastAsia="Aptos Display" w:cs="Aptos Display"/>
+          <w:b w:val="0"/>
+          <w:bCs w:val="0"/>
+          <w:i w:val="0"/>
+          <w:iCs w:val="0"/>
+          <w:caps w:val="0"/>
+          <w:smallCaps w:val="0"/>
+          <w:noProof w:val="0"/>
+          <w:color w:val="0F4761" w:themeColor="accent1" w:themeTint="FF" w:themeShade="BF"/>
+          <w:sz w:val="40"/>
+          <w:szCs w:val="40"/>
+          <w:lang w:val="en-US"/>
+        </w:rPr>
+      </w:pPr>
+      <w:r>
+        <w:rPr>
+          <w:rFonts w:ascii="Aptos Display" w:hAnsi="Aptos Display" w:eastAsia="Aptos Display" w:cs="Aptos Display"/>
+          <w:b w:val="0"/>
+          <w:bCs w:val="0"/>
+          <w:i w:val="0"/>
+          <w:iCs w:val="0"/>
+          <w:caps w:val="0"/>
+          <w:smallCaps w:val="0"/>
+          <w:noProof w:val="0"/>
+          <w:color w:val="0F4761" w:themeColor="accent1" w:themeTint="FF" w:themeShade="BF"/>
+          <w:sz w:val="40"/>
+          <w:szCs w:val="40"/>
+          <w:lang w:val="en-US"/>
+        </w:rPr>
+        <w:t>References</w:t>
+      </w:r>
+    </w:p>
+    <w:p xmlns:wp14="http://schemas.microsoft.com/office/word/2010/wordml" wp14:paraId="58407268" wp14:textId="3F33F279">
+      <w:pPr>
+        <w:spacing w:before="0" w:beforeAutospacing="off" w:after="240" w:afterAutospacing="off" w:line="360" w:lineRule="auto"/>
+        <w:rPr>
+          <w:rFonts w:ascii="Aptos" w:hAnsi="Aptos" w:eastAsia="Aptos" w:cs="Aptos"/>
+          <w:b w:val="0"/>
+          <w:bCs w:val="0"/>
+          <w:i w:val="0"/>
+          <w:iCs w:val="0"/>
+          <w:caps w:val="0"/>
+          <w:smallCaps w:val="0"/>
+          <w:noProof w:val="0"/>
+          <w:color w:val="000000" w:themeColor="text1" w:themeTint="FF" w:themeShade="FF"/>
+          <w:sz w:val="24"/>
+          <w:szCs w:val="24"/>
+          <w:lang w:val="en-US"/>
+        </w:rPr>
+      </w:pPr>
+      <w:r>
+        <w:rPr>
+          <w:rFonts w:ascii="Aptos" w:hAnsi="Aptos" w:eastAsia="Aptos" w:cs="Aptos"/>
+          <w:b w:val="0"/>
+          <w:bCs w:val="0"/>
+          <w:i w:val="0"/>
+          <w:iCs w:val="0"/>
+          <w:caps w:val="0"/>
+          <w:smallCaps w:val="0"/>
+          <w:noProof w:val="0"/>
+          <w:color w:val="000000" w:themeColor="text1" w:themeTint="FF" w:themeShade="FF"/>
+          <w:sz w:val="24"/>
+          <w:szCs w:val="24"/>
+          <w:lang w:val="en-US"/>
+        </w:rPr>
+        <w:t xml:space="preserve">Atlassian (2024). </w:t>
+      </w:r>
+      <w:r>
+        <w:rPr>
+          <w:rFonts w:ascii="Aptos" w:hAnsi="Aptos" w:eastAsia="Aptos" w:cs="Aptos"/>
+          <w:b w:val="0"/>
+          <w:bCs w:val="0"/>
+          <w:i w:val="1"/>
+          <w:iCs w:val="1"/>
+          <w:caps w:val="0"/>
+          <w:smallCaps w:val="0"/>
+          <w:noProof w:val="0"/>
+          <w:color w:val="000000" w:themeColor="text1" w:themeTint="FF" w:themeShade="FF"/>
+          <w:sz w:val="24"/>
+          <w:szCs w:val="24"/>
+          <w:lang w:val="en-US"/>
+        </w:rPr>
+        <w:t>What is version control</w:t>
+      </w:r>
+      <w:r>
+        <w:rPr>
+          <w:rFonts w:ascii="Aptos" w:hAnsi="Aptos" w:eastAsia="Aptos" w:cs="Aptos"/>
+          <w:b w:val="0"/>
+          <w:bCs w:val="0"/>
+          <w:i w:val="0"/>
+          <w:iCs w:val="0"/>
+          <w:caps w:val="0"/>
+          <w:smallCaps w:val="0"/>
+          <w:noProof w:val="0"/>
+          <w:color w:val="000000" w:themeColor="text1" w:themeTint="FF" w:themeShade="FF"/>
+          <w:sz w:val="24"/>
+          <w:szCs w:val="24"/>
+          <w:lang w:val="en-US"/>
+        </w:rPr>
+        <w:t xml:space="preserve">. [online] Atlassian. Available at: </w:t>
+      </w:r>
+      <w:hyperlink r:id="Ra5ad72a4849d4fd4">
+        <w:r>
+          <w:rPr>
+            <w:rStyle w:val="Hyperlink"/>
+            <w:b w:val="0"/>
+            <w:bCs w:val="0"/>
+            <w:i w:val="0"/>
+            <w:iCs w:val="0"/>
+            <w:caps w:val="0"/>
+            <w:smallCaps w:val="0"/>
+            <w:strike w:val="0"/>
+            <w:dstrike w:val="0"/>
+            <w:noProof w:val="0"/>
+            <w:lang w:val="en-US"/>
+          </w:rPr>
+          <w:t>https://www.atlassian.com/git/tutorials/what-is-version-control</w:t>
+        </w:r>
+      </w:hyperlink>
+      <w:r>
+        <w:rPr>
+          <w:rFonts w:ascii="Aptos" w:hAnsi="Aptos" w:eastAsia="Aptos" w:cs="Aptos"/>
+          <w:b w:val="0"/>
+          <w:bCs w:val="0"/>
+          <w:i w:val="0"/>
+          <w:iCs w:val="0"/>
+          <w:caps w:val="0"/>
+          <w:smallCaps w:val="0"/>
+          <w:noProof w:val="0"/>
+          <w:color w:val="000000" w:themeColor="text1" w:themeTint="FF" w:themeShade="FF"/>
+          <w:sz w:val="24"/>
+          <w:szCs w:val="24"/>
+          <w:lang w:val="en-US"/>
+        </w:rPr>
+        <w:t xml:space="preserve"> [Accessed 8 Sept. 2026].</w:t>
+      </w:r>
+    </w:p>
+    <w:p xmlns:wp14="http://schemas.microsoft.com/office/word/2010/wordml" wp14:paraId="6139970F" wp14:textId="6C9F9D33">
+      <w:pPr>
+        <w:spacing w:before="0" w:beforeAutospacing="off" w:after="240" w:afterAutospacing="off" w:line="360" w:lineRule="auto"/>
+        <w:rPr>
+          <w:rFonts w:ascii="Aptos" w:hAnsi="Aptos" w:eastAsia="Aptos" w:cs="Aptos"/>
+          <w:b w:val="0"/>
+          <w:bCs w:val="0"/>
+          <w:i w:val="0"/>
+          <w:iCs w:val="0"/>
+          <w:caps w:val="0"/>
+          <w:smallCaps w:val="0"/>
+          <w:noProof w:val="0"/>
+          <w:color w:val="000000" w:themeColor="text1" w:themeTint="FF" w:themeShade="FF"/>
+          <w:sz w:val="24"/>
+          <w:szCs w:val="24"/>
+          <w:lang w:val="en-US"/>
+        </w:rPr>
+      </w:pPr>
+      <w:r>
+        <w:rPr>
+          <w:rFonts w:ascii="Aptos" w:hAnsi="Aptos" w:eastAsia="Aptos" w:cs="Aptos"/>
+          <w:b w:val="0"/>
+          <w:bCs w:val="0"/>
+          <w:i w:val="0"/>
+          <w:iCs w:val="0"/>
+          <w:caps w:val="0"/>
+          <w:smallCaps w:val="0"/>
+          <w:noProof w:val="0"/>
+          <w:color w:val="000000" w:themeColor="text1" w:themeTint="FF" w:themeShade="FF"/>
+          <w:sz w:val="24"/>
+          <w:szCs w:val="24"/>
+          <w:lang w:val="en-US"/>
+        </w:rPr>
+        <w:t xml:space="preserve">David Rendon (2026). </w:t>
+      </w:r>
+      <w:r>
+        <w:rPr>
+          <w:rFonts w:ascii="Aptos" w:hAnsi="Aptos" w:eastAsia="Aptos" w:cs="Aptos"/>
+          <w:b w:val="0"/>
+          <w:bCs w:val="0"/>
+          <w:i w:val="1"/>
+          <w:iCs w:val="1"/>
+          <w:caps w:val="0"/>
+          <w:smallCaps w:val="0"/>
+          <w:noProof w:val="0"/>
+          <w:color w:val="000000" w:themeColor="text1" w:themeTint="FF" w:themeShade="FF"/>
+          <w:sz w:val="24"/>
+          <w:szCs w:val="24"/>
+          <w:lang w:val="en-US"/>
+        </w:rPr>
+        <w:t>How GitHub enterprise governance lets you ship secure code at scale without slowing down your…</w:t>
+      </w:r>
+      <w:r>
+        <w:rPr>
+          <w:rFonts w:ascii="Aptos" w:hAnsi="Aptos" w:eastAsia="Aptos" w:cs="Aptos"/>
+          <w:b w:val="0"/>
+          <w:bCs w:val="0"/>
+          <w:i w:val="0"/>
+          <w:iCs w:val="0"/>
+          <w:caps w:val="0"/>
+          <w:smallCaps w:val="0"/>
+          <w:noProof w:val="0"/>
+          <w:color w:val="000000" w:themeColor="text1" w:themeTint="FF" w:themeShade="FF"/>
+          <w:sz w:val="24"/>
+          <w:szCs w:val="24"/>
+          <w:lang w:val="en-US"/>
+        </w:rPr>
+        <w:t xml:space="preserve">. [online] Medium. Available at: </w:t>
+      </w:r>
+      <w:hyperlink r:id="R8b1ad3cc8f954ed0">
+        <w:r>
+          <w:rPr>
+            <w:rStyle w:val="Hyperlink"/>
+            <w:b w:val="0"/>
+            <w:bCs w:val="0"/>
+            <w:i w:val="0"/>
+            <w:iCs w:val="0"/>
+            <w:caps w:val="0"/>
+            <w:smallCaps w:val="0"/>
+            <w:strike w:val="0"/>
+            <w:dstrike w:val="0"/>
+            <w:noProof w:val="0"/>
+            <w:lang w:val="en-US"/>
+          </w:rPr>
+          <w:t>https://medium.com/codex/how-github-enterprise-governance-lets-you-ship-secure-code-at-scale-without-slowing-down-your-90b83a0dba2f</w:t>
+        </w:r>
+      </w:hyperlink>
+      <w:r>
+        <w:rPr>
+          <w:rFonts w:ascii="Aptos" w:hAnsi="Aptos" w:eastAsia="Aptos" w:cs="Aptos"/>
+          <w:b w:val="0"/>
+          <w:bCs w:val="0"/>
+          <w:i w:val="0"/>
+          <w:iCs w:val="0"/>
+          <w:caps w:val="0"/>
+          <w:smallCaps w:val="0"/>
+          <w:noProof w:val="0"/>
+          <w:color w:val="000000" w:themeColor="text1" w:themeTint="FF" w:themeShade="FF"/>
+          <w:sz w:val="24"/>
+          <w:szCs w:val="24"/>
+          <w:lang w:val="en-US"/>
+        </w:rPr>
+        <w:t xml:space="preserve"> [Accessed 8 Sept. 2026].</w:t>
+      </w:r>
+    </w:p>
+    <w:p xmlns:wp14="http://schemas.microsoft.com/office/word/2010/wordml" wp14:paraId="7C701CAB" wp14:textId="01999034">
+      <w:pPr>
+        <w:spacing w:before="0" w:beforeAutospacing="off" w:after="240" w:afterAutospacing="off" w:line="360" w:lineRule="auto"/>
+        <w:rPr>
+          <w:rFonts w:ascii="Aptos" w:hAnsi="Aptos" w:eastAsia="Aptos" w:cs="Aptos"/>
+          <w:b w:val="0"/>
+          <w:bCs w:val="0"/>
+          <w:i w:val="0"/>
+          <w:iCs w:val="0"/>
+          <w:caps w:val="0"/>
+          <w:smallCaps w:val="0"/>
+          <w:noProof w:val="0"/>
+          <w:color w:val="000000" w:themeColor="text1" w:themeTint="FF" w:themeShade="FF"/>
+          <w:sz w:val="24"/>
+          <w:szCs w:val="24"/>
+          <w:lang w:val="en-US"/>
+        </w:rPr>
+      </w:pPr>
+      <w:r>
+        <w:rPr>
+          <w:rFonts w:ascii="Aptos" w:hAnsi="Aptos" w:eastAsia="Aptos" w:cs="Aptos"/>
+          <w:b w:val="0"/>
+          <w:bCs w:val="0"/>
+          <w:i w:val="0"/>
+          <w:iCs w:val="0"/>
+          <w:caps w:val="0"/>
+          <w:smallCaps w:val="0"/>
+          <w:noProof w:val="0"/>
+          <w:color w:val="000000" w:themeColor="text1" w:themeTint="FF" w:themeShade="FF"/>
+          <w:sz w:val="24"/>
+          <w:szCs w:val="24"/>
+          <w:lang w:val="en-US"/>
+        </w:rPr>
+        <w:t xml:space="preserve">Github (n.d.). </w:t>
+      </w:r>
+      <w:r>
+        <w:rPr>
+          <w:rFonts w:ascii="Aptos" w:hAnsi="Aptos" w:eastAsia="Aptos" w:cs="Aptos"/>
+          <w:b w:val="0"/>
+          <w:bCs w:val="0"/>
+          <w:i w:val="1"/>
+          <w:iCs w:val="1"/>
+          <w:caps w:val="0"/>
+          <w:smallCaps w:val="0"/>
+          <w:noProof w:val="0"/>
+          <w:color w:val="000000" w:themeColor="text1" w:themeTint="FF" w:themeShade="FF"/>
+          <w:sz w:val="24"/>
+          <w:szCs w:val="24"/>
+          <w:lang w:val="en-US"/>
+        </w:rPr>
+        <w:t>About protected branches</w:t>
+      </w:r>
+      <w:r>
+        <w:rPr>
+          <w:rFonts w:ascii="Aptos" w:hAnsi="Aptos" w:eastAsia="Aptos" w:cs="Aptos"/>
+          <w:b w:val="0"/>
+          <w:bCs w:val="0"/>
+          <w:i w:val="0"/>
+          <w:iCs w:val="0"/>
+          <w:caps w:val="0"/>
+          <w:smallCaps w:val="0"/>
+          <w:noProof w:val="0"/>
+          <w:color w:val="000000" w:themeColor="text1" w:themeTint="FF" w:themeShade="FF"/>
+          <w:sz w:val="24"/>
+          <w:szCs w:val="24"/>
+          <w:lang w:val="en-US"/>
+        </w:rPr>
+        <w:t xml:space="preserve">. [online] GitHub Docs. Available at: </w:t>
+      </w:r>
+      <w:hyperlink r:id="Rbde1f9b316614b0b">
+        <w:r>
+          <w:rPr>
+            <w:rStyle w:val="Hyperlink"/>
+            <w:b w:val="0"/>
+            <w:bCs w:val="0"/>
+            <w:i w:val="0"/>
+            <w:iCs w:val="0"/>
+            <w:caps w:val="0"/>
+            <w:smallCaps w:val="0"/>
+            <w:strike w:val="0"/>
+            <w:dstrike w:val="0"/>
+            <w:noProof w:val="0"/>
+            <w:lang w:val="en-US"/>
+          </w:rPr>
+          <w:t>https://docs.github.com/en/repositories/configuring-branches-and-merges-in-your-repository/managing-protected-branches/about-protected-branches</w:t>
+        </w:r>
+      </w:hyperlink>
+      <w:r>
+        <w:rPr>
+          <w:rFonts w:ascii="Aptos" w:hAnsi="Aptos" w:eastAsia="Aptos" w:cs="Aptos"/>
+          <w:b w:val="0"/>
+          <w:bCs w:val="0"/>
+          <w:i w:val="0"/>
+          <w:iCs w:val="0"/>
+          <w:caps w:val="0"/>
+          <w:smallCaps w:val="0"/>
+          <w:noProof w:val="0"/>
+          <w:color w:val="000000" w:themeColor="text1" w:themeTint="FF" w:themeShade="FF"/>
+          <w:sz w:val="24"/>
+          <w:szCs w:val="24"/>
+          <w:lang w:val="en-US"/>
+        </w:rPr>
+        <w:t xml:space="preserve"> [Accessed 8 Sept. 2026].</w:t>
+      </w:r>
+    </w:p>
+    <w:p xmlns:wp14="http://schemas.microsoft.com/office/word/2010/wordml" wp14:paraId="227E1F6A" wp14:textId="391404AF">
+      <w:pPr>
+        <w:spacing w:before="0" w:beforeAutospacing="off" w:after="240" w:afterAutospacing="off" w:line="360" w:lineRule="auto"/>
+        <w:rPr>
+          <w:rFonts w:ascii="Aptos" w:hAnsi="Aptos" w:eastAsia="Aptos" w:cs="Aptos"/>
+          <w:b w:val="0"/>
+          <w:bCs w:val="0"/>
+          <w:i w:val="0"/>
+          <w:iCs w:val="0"/>
+          <w:caps w:val="0"/>
+          <w:smallCaps w:val="0"/>
+          <w:noProof w:val="0"/>
+          <w:color w:val="000000" w:themeColor="text1" w:themeTint="FF" w:themeShade="FF"/>
+          <w:sz w:val="24"/>
+          <w:szCs w:val="24"/>
+          <w:lang w:val="en-US"/>
+        </w:rPr>
+      </w:pPr>
+      <w:r>
+        <w:rPr>
+          <w:rFonts w:ascii="Aptos" w:hAnsi="Aptos" w:eastAsia="Aptos" w:cs="Aptos"/>
+          <w:b w:val="0"/>
+          <w:bCs w:val="0"/>
+          <w:i w:val="0"/>
+          <w:iCs w:val="0"/>
+          <w:caps w:val="0"/>
+          <w:smallCaps w:val="0"/>
+          <w:noProof w:val="0"/>
+          <w:color w:val="000000" w:themeColor="text1" w:themeTint="FF" w:themeShade="FF"/>
+          <w:sz w:val="24"/>
+          <w:szCs w:val="24"/>
+          <w:lang w:val="en-US"/>
+        </w:rPr>
+        <w:t xml:space="preserve">Marius Golombeck, Orlowski, H. and Tübben, S. (2018). </w:t>
+      </w:r>
+      <w:r>
+        <w:rPr>
+          <w:rFonts w:ascii="Aptos" w:hAnsi="Aptos" w:eastAsia="Aptos" w:cs="Aptos"/>
+          <w:b w:val="0"/>
+          <w:bCs w:val="0"/>
+          <w:i w:val="1"/>
+          <w:iCs w:val="1"/>
+          <w:caps w:val="0"/>
+          <w:smallCaps w:val="0"/>
+          <w:noProof w:val="0"/>
+          <w:color w:val="000000" w:themeColor="text1" w:themeTint="FF" w:themeShade="FF"/>
+          <w:sz w:val="24"/>
+          <w:szCs w:val="24"/>
+          <w:lang w:val="en-US"/>
+        </w:rPr>
+        <w:t>Collaborative Software Development with GitHub® Projects</w:t>
+      </w:r>
+      <w:r>
+        <w:rPr>
+          <w:rFonts w:ascii="Aptos" w:hAnsi="Aptos" w:eastAsia="Aptos" w:cs="Aptos"/>
+          <w:b w:val="0"/>
+          <w:bCs w:val="0"/>
+          <w:i w:val="0"/>
+          <w:iCs w:val="0"/>
+          <w:caps w:val="0"/>
+          <w:smallCaps w:val="0"/>
+          <w:noProof w:val="0"/>
+          <w:color w:val="000000" w:themeColor="text1" w:themeTint="FF" w:themeShade="FF"/>
+          <w:sz w:val="24"/>
+          <w:szCs w:val="24"/>
+          <w:lang w:val="en-US"/>
+        </w:rPr>
+        <w:t xml:space="preserve">. [online] Available at: </w:t>
+      </w:r>
+      <w:hyperlink r:id="R657c4e7ec4694135">
+        <w:r>
+          <w:rPr>
+            <w:rStyle w:val="Hyperlink"/>
+            <w:b w:val="0"/>
+            <w:bCs w:val="0"/>
+            <w:i w:val="0"/>
+            <w:iCs w:val="0"/>
+            <w:caps w:val="0"/>
+            <w:smallCaps w:val="0"/>
+            <w:strike w:val="0"/>
+            <w:dstrike w:val="0"/>
+            <w:noProof w:val="0"/>
+            <w:lang w:val="en-US"/>
+          </w:rPr>
+          <w:t>https://www.researchgate.net/publication/330162832_Collaborative_Software_Development_with_GitHubR_Projects</w:t>
+        </w:r>
+      </w:hyperlink>
+      <w:r>
+        <w:rPr>
+          <w:rFonts w:ascii="Aptos" w:hAnsi="Aptos" w:eastAsia="Aptos" w:cs="Aptos"/>
+          <w:b w:val="0"/>
+          <w:bCs w:val="0"/>
+          <w:i w:val="0"/>
+          <w:iCs w:val="0"/>
+          <w:caps w:val="0"/>
+          <w:smallCaps w:val="0"/>
+          <w:noProof w:val="0"/>
+          <w:color w:val="000000" w:themeColor="text1" w:themeTint="FF" w:themeShade="FF"/>
+          <w:sz w:val="24"/>
+          <w:szCs w:val="24"/>
+          <w:lang w:val="en-US"/>
+        </w:rPr>
+        <w:t xml:space="preserve"> [Accessed 8 Sept. 2026].</w:t>
+      </w:r>
+    </w:p>
+    <w:p xmlns:wp14="http://schemas.microsoft.com/office/word/2010/wordml" wp14:paraId="220A8A14" wp14:textId="3529FCB0">
+      <w:pPr>
+        <w:spacing w:before="0" w:beforeAutospacing="off" w:after="240" w:afterAutospacing="off" w:line="360" w:lineRule="auto"/>
+        <w:rPr>
+          <w:rFonts w:ascii="Aptos" w:hAnsi="Aptos" w:eastAsia="Aptos" w:cs="Aptos"/>
+          <w:b w:val="0"/>
+          <w:bCs w:val="0"/>
+          <w:i w:val="0"/>
+          <w:iCs w:val="0"/>
+          <w:caps w:val="0"/>
+          <w:smallCaps w:val="0"/>
+          <w:noProof w:val="0"/>
+          <w:color w:val="000000" w:themeColor="text1" w:themeTint="FF" w:themeShade="FF"/>
+          <w:sz w:val="24"/>
+          <w:szCs w:val="24"/>
+          <w:lang w:val="en-US"/>
+        </w:rPr>
+      </w:pPr>
+      <w:r>
+        <w:rPr>
+          <w:rFonts w:ascii="Aptos" w:hAnsi="Aptos" w:eastAsia="Aptos" w:cs="Aptos"/>
+          <w:b w:val="0"/>
+          <w:bCs w:val="0"/>
+          <w:i w:val="0"/>
+          <w:iCs w:val="0"/>
+          <w:caps w:val="0"/>
+          <w:smallCaps w:val="0"/>
+          <w:noProof w:val="0"/>
+          <w:color w:val="000000" w:themeColor="text1" w:themeTint="FF" w:themeShade="FF"/>
+          <w:sz w:val="24"/>
+          <w:szCs w:val="24"/>
+          <w:lang w:val="en-US"/>
+        </w:rPr>
+        <w:t xml:space="preserve">McGrath, A. and Jonker, A. (2024). </w:t>
+      </w:r>
+      <w:r>
+        <w:rPr>
+          <w:rFonts w:ascii="Aptos" w:hAnsi="Aptos" w:eastAsia="Aptos" w:cs="Aptos"/>
+          <w:b w:val="0"/>
+          <w:bCs w:val="0"/>
+          <w:i w:val="1"/>
+          <w:iCs w:val="1"/>
+          <w:caps w:val="0"/>
+          <w:smallCaps w:val="0"/>
+          <w:noProof w:val="0"/>
+          <w:color w:val="000000" w:themeColor="text1" w:themeTint="FF" w:themeShade="FF"/>
+          <w:sz w:val="24"/>
+          <w:szCs w:val="24"/>
+          <w:lang w:val="en-US"/>
+        </w:rPr>
+        <w:t>AI compliance</w:t>
+      </w:r>
+      <w:r>
+        <w:rPr>
+          <w:rFonts w:ascii="Aptos" w:hAnsi="Aptos" w:eastAsia="Aptos" w:cs="Aptos"/>
+          <w:b w:val="0"/>
+          <w:bCs w:val="0"/>
+          <w:i w:val="0"/>
+          <w:iCs w:val="0"/>
+          <w:caps w:val="0"/>
+          <w:smallCaps w:val="0"/>
+          <w:noProof w:val="0"/>
+          <w:color w:val="000000" w:themeColor="text1" w:themeTint="FF" w:themeShade="FF"/>
+          <w:sz w:val="24"/>
+          <w:szCs w:val="24"/>
+          <w:lang w:val="en-US"/>
+        </w:rPr>
+        <w:t xml:space="preserve">. [online] Ibm.com. Available at: </w:t>
+      </w:r>
+      <w:hyperlink r:id="Rdcf4ea6adcda4625">
+        <w:r>
+          <w:rPr>
+            <w:rStyle w:val="Hyperlink"/>
+            <w:b w:val="0"/>
+            <w:bCs w:val="0"/>
+            <w:i w:val="0"/>
+            <w:iCs w:val="0"/>
+            <w:caps w:val="0"/>
+            <w:smallCaps w:val="0"/>
+            <w:strike w:val="0"/>
+            <w:dstrike w:val="0"/>
+            <w:noProof w:val="0"/>
+            <w:lang w:val="en-US"/>
+          </w:rPr>
+          <w:t>https://www.ibm.com/think/insights/ai-compliance</w:t>
+        </w:r>
+      </w:hyperlink>
+      <w:r>
+        <w:rPr>
+          <w:rFonts w:ascii="Aptos" w:hAnsi="Aptos" w:eastAsia="Aptos" w:cs="Aptos"/>
+          <w:b w:val="0"/>
+          <w:bCs w:val="0"/>
+          <w:i w:val="0"/>
+          <w:iCs w:val="0"/>
+          <w:caps w:val="0"/>
+          <w:smallCaps w:val="0"/>
+          <w:noProof w:val="0"/>
+          <w:color w:val="000000" w:themeColor="text1" w:themeTint="FF" w:themeShade="FF"/>
+          <w:sz w:val="24"/>
+          <w:szCs w:val="24"/>
+          <w:lang w:val="en-US"/>
+        </w:rPr>
+        <w:t xml:space="preserve"> [Accessed 9 Sept. 2026].</w:t>
+      </w:r>
+    </w:p>
+    <w:p xmlns:wp14="http://schemas.microsoft.com/office/word/2010/wordml" wp14:paraId="1C3867AE" wp14:textId="04C452E6">
+      <w:pPr>
+        <w:spacing w:before="0" w:beforeAutospacing="off" w:after="240" w:afterAutospacing="off" w:line="360" w:lineRule="auto"/>
+        <w:rPr>
+          <w:rFonts w:ascii="Aptos" w:hAnsi="Aptos" w:eastAsia="Aptos" w:cs="Aptos"/>
+          <w:b w:val="0"/>
+          <w:bCs w:val="0"/>
+          <w:i w:val="0"/>
+          <w:iCs w:val="0"/>
+          <w:caps w:val="0"/>
+          <w:smallCaps w:val="0"/>
+          <w:noProof w:val="0"/>
+          <w:color w:val="000000" w:themeColor="text1" w:themeTint="FF" w:themeShade="FF"/>
+          <w:sz w:val="24"/>
+          <w:szCs w:val="24"/>
+          <w:lang w:val="en-US"/>
+        </w:rPr>
+      </w:pPr>
+      <w:r>
+        <w:rPr>
+          <w:rFonts w:ascii="Aptos" w:hAnsi="Aptos" w:eastAsia="Aptos" w:cs="Aptos"/>
+          <w:b w:val="0"/>
+          <w:bCs w:val="0"/>
+          <w:i w:val="0"/>
+          <w:iCs w:val="0"/>
+          <w:caps w:val="0"/>
+          <w:smallCaps w:val="0"/>
+          <w:noProof w:val="0"/>
+          <w:color w:val="000000" w:themeColor="text1" w:themeTint="FF" w:themeShade="FF"/>
+          <w:sz w:val="24"/>
+          <w:szCs w:val="24"/>
+          <w:lang w:val="en-US"/>
+        </w:rPr>
+        <w:t xml:space="preserve">Sreejith Sreejayan (2025). </w:t>
+      </w:r>
+      <w:r>
+        <w:rPr>
+          <w:rFonts w:ascii="Aptos" w:hAnsi="Aptos" w:eastAsia="Aptos" w:cs="Aptos"/>
+          <w:b w:val="0"/>
+          <w:bCs w:val="0"/>
+          <w:i w:val="1"/>
+          <w:iCs w:val="1"/>
+          <w:caps w:val="0"/>
+          <w:smallCaps w:val="0"/>
+          <w:noProof w:val="0"/>
+          <w:color w:val="000000" w:themeColor="text1" w:themeTint="FF" w:themeShade="FF"/>
+          <w:sz w:val="24"/>
+          <w:szCs w:val="24"/>
+          <w:lang w:val="en-US"/>
+        </w:rPr>
+        <w:t>How to use AI for your software project: A complete guide for 2025</w:t>
+      </w:r>
+      <w:r>
+        <w:rPr>
+          <w:rFonts w:ascii="Aptos" w:hAnsi="Aptos" w:eastAsia="Aptos" w:cs="Aptos"/>
+          <w:b w:val="0"/>
+          <w:bCs w:val="0"/>
+          <w:i w:val="0"/>
+          <w:iCs w:val="0"/>
+          <w:caps w:val="0"/>
+          <w:smallCaps w:val="0"/>
+          <w:noProof w:val="0"/>
+          <w:color w:val="000000" w:themeColor="text1" w:themeTint="FF" w:themeShade="FF"/>
+          <w:sz w:val="24"/>
+          <w:szCs w:val="24"/>
+          <w:lang w:val="en-US"/>
+        </w:rPr>
+        <w:t xml:space="preserve">. [online] Medium. Available at: </w:t>
+      </w:r>
+      <w:hyperlink r:id="R25c298f3248d4d8a">
+        <w:r>
+          <w:rPr>
+            <w:rStyle w:val="Hyperlink"/>
+            <w:b w:val="0"/>
+            <w:bCs w:val="0"/>
+            <w:i w:val="0"/>
+            <w:iCs w:val="0"/>
+            <w:caps w:val="0"/>
+            <w:smallCaps w:val="0"/>
+            <w:strike w:val="0"/>
+            <w:dstrike w:val="0"/>
+            <w:noProof w:val="0"/>
+            <w:lang w:val="en-US"/>
+          </w:rPr>
+          <w:t>https://medium.com/@the-sreejith/how-to-use-ai-for-your-software-project-a-complete-guide-for-2025-3dda56c3fb23</w:t>
+        </w:r>
+      </w:hyperlink>
+      <w:r>
+        <w:rPr>
+          <w:rFonts w:ascii="Aptos" w:hAnsi="Aptos" w:eastAsia="Aptos" w:cs="Aptos"/>
+          <w:b w:val="0"/>
+          <w:bCs w:val="0"/>
+          <w:i w:val="0"/>
+          <w:iCs w:val="0"/>
+          <w:caps w:val="0"/>
+          <w:smallCaps w:val="0"/>
+          <w:noProof w:val="0"/>
+          <w:color w:val="000000" w:themeColor="text1" w:themeTint="FF" w:themeShade="FF"/>
+          <w:sz w:val="24"/>
+          <w:szCs w:val="24"/>
+          <w:lang w:val="en-US"/>
+        </w:rPr>
+        <w:t xml:space="preserve"> [Accessed 9 Sept. 2026].</w:t>
+      </w:r>
+    </w:p>
+    <w:p xmlns:wp14="http://schemas.microsoft.com/office/word/2010/wordml" wp14:paraId="6E0214D8" wp14:textId="36C5D162">
+      <w:pPr>
+        <w:rPr>
+          <w:rFonts w:ascii="Aptos" w:hAnsi="Aptos" w:eastAsia="Aptos" w:cs="Aptos"/>
+          <w:b w:val="0"/>
+          <w:bCs w:val="0"/>
+          <w:i w:val="0"/>
+          <w:iCs w:val="0"/>
+          <w:caps w:val="0"/>
+          <w:smallCaps w:val="0"/>
+          <w:noProof w:val="0"/>
+          <w:color w:val="000000" w:themeColor="text1" w:themeTint="FF" w:themeShade="FF"/>
+          <w:sz w:val="24"/>
+          <w:szCs w:val="24"/>
+          <w:lang w:val="en-US"/>
+        </w:rPr>
+      </w:pPr>
+    </w:p>
+    <w:p xmlns:wp14="http://schemas.microsoft.com/office/word/2010/wordml" wp14:paraId="00011DB0" wp14:textId="02789A0B">
+      <w:pPr>
+        <w:rPr>
+          <w:rFonts w:ascii="Aptos" w:hAnsi="Aptos" w:eastAsia="Aptos" w:cs="Aptos"/>
+          <w:b w:val="0"/>
+          <w:bCs w:val="0"/>
+          <w:i w:val="0"/>
+          <w:iCs w:val="0"/>
+          <w:caps w:val="0"/>
+          <w:smallCaps w:val="0"/>
+          <w:noProof w:val="0"/>
+          <w:color w:val="000000" w:themeColor="text1" w:themeTint="FF" w:themeShade="FF"/>
+          <w:sz w:val="24"/>
+          <w:szCs w:val="24"/>
+          <w:lang w:val="en-US"/>
+        </w:rPr>
+      </w:pPr>
+    </w:p>
+    <w:p xmlns:wp14="http://schemas.microsoft.com/office/word/2010/wordml" wp14:paraId="327779D3" wp14:textId="1E866C80">
+      <w:pPr>
+        <w:rPr>
+          <w:rFonts w:ascii="Aptos" w:hAnsi="Aptos" w:eastAsia="Aptos" w:cs="Aptos"/>
+          <w:b w:val="0"/>
+          <w:bCs w:val="0"/>
+          <w:i w:val="0"/>
+          <w:iCs w:val="0"/>
+          <w:caps w:val="0"/>
+          <w:smallCaps w:val="0"/>
+          <w:noProof w:val="0"/>
+          <w:color w:val="000000" w:themeColor="text1" w:themeTint="FF" w:themeShade="FF"/>
+          <w:sz w:val="24"/>
+          <w:szCs w:val="24"/>
+          <w:lang w:val="en-US"/>
+        </w:rPr>
+      </w:pPr>
+    </w:p>
+    <w:p xmlns:wp14="http://schemas.microsoft.com/office/word/2010/wordml" wp14:paraId="24064003" wp14:textId="7CE2B5CD">
+      <w:pPr>
+        <w:ind w:left="2160"/>
+        <w:rPr>
+          <w:rFonts w:ascii="Aptos" w:hAnsi="Aptos" w:eastAsia="Aptos" w:cs="Aptos"/>
+          <w:b w:val="0"/>
+          <w:bCs w:val="0"/>
+          <w:i w:val="0"/>
+          <w:iCs w:val="0"/>
+          <w:caps w:val="0"/>
+          <w:smallCaps w:val="0"/>
+          <w:noProof w:val="0"/>
+          <w:color w:val="000000" w:themeColor="text1" w:themeTint="FF" w:themeShade="FF"/>
+          <w:sz w:val="24"/>
+          <w:szCs w:val="24"/>
+          <w:lang w:val="en-US"/>
+        </w:rPr>
+      </w:pPr>
+    </w:p>
+    <w:p xmlns:wp14="http://schemas.microsoft.com/office/word/2010/wordml" wp14:paraId="1EC4E796" wp14:textId="625D05A3">
+      <w:pPr>
+        <w:rPr>
+          <w:rFonts w:ascii="Aptos" w:hAnsi="Aptos" w:eastAsia="Aptos" w:cs="Aptos"/>
+          <w:b w:val="0"/>
+          <w:bCs w:val="0"/>
+          <w:i w:val="0"/>
+          <w:iCs w:val="0"/>
+          <w:caps w:val="0"/>
+          <w:smallCaps w:val="0"/>
+          <w:noProof w:val="0"/>
+          <w:color w:val="000000" w:themeColor="text1" w:themeTint="FF" w:themeShade="FF"/>
+          <w:sz w:val="24"/>
+          <w:szCs w:val="24"/>
+          <w:lang w:val="en-US"/>
+        </w:rPr>
+      </w:pPr>
+    </w:p>
+    <w:p xmlns:wp14="http://schemas.microsoft.com/office/word/2010/wordml" wp14:paraId="71CB2B12" wp14:textId="55D10929">
+      <w:pPr>
+        <w:rPr>
+          <w:rFonts w:ascii="Aptos" w:hAnsi="Aptos" w:eastAsia="Aptos" w:cs="Aptos"/>
+          <w:b w:val="0"/>
+          <w:bCs w:val="0"/>
+          <w:i w:val="0"/>
+          <w:iCs w:val="0"/>
+          <w:caps w:val="0"/>
+          <w:smallCaps w:val="0"/>
+          <w:noProof w:val="0"/>
+          <w:color w:val="000000" w:themeColor="text1" w:themeTint="FF" w:themeShade="FF"/>
+          <w:sz w:val="24"/>
+          <w:szCs w:val="24"/>
+          <w:lang w:val="en-US"/>
+        </w:rPr>
+      </w:pPr>
+    </w:p>
+    <w:p xmlns:wp14="http://schemas.microsoft.com/office/word/2010/wordml" wp14:paraId="352E766C" wp14:textId="42F78ABC">
+      <w:pPr>
+        <w:rPr>
+          <w:rFonts w:ascii="Aptos" w:hAnsi="Aptos" w:eastAsia="Aptos" w:cs="Aptos"/>
+          <w:b w:val="0"/>
+          <w:bCs w:val="0"/>
+          <w:i w:val="0"/>
+          <w:iCs w:val="0"/>
+          <w:caps w:val="0"/>
+          <w:smallCaps w:val="0"/>
+          <w:noProof w:val="0"/>
+          <w:color w:val="000000" w:themeColor="text1" w:themeTint="FF" w:themeShade="FF"/>
+          <w:sz w:val="24"/>
+          <w:szCs w:val="24"/>
+          <w:lang w:val="en-US"/>
+        </w:rPr>
+      </w:pPr>
+    </w:p>
+    <w:p xmlns:wp14="http://schemas.microsoft.com/office/word/2010/wordml" wp14:paraId="2C078E63" wp14:textId="22D953B0"/>
     <w:sectPr>
-      <w:pgSz w:w="12240" w:h="15840"/>
+      <w:pgSz w:w="12240" w:h="15840" w:orient="portrait"/>
       <w:pgMar w:top="1440" w:right="1440" w:bottom="1440" w:left="1440" w:header="720" w:footer="720" w:gutter="0"/>
       <w:cols w:space="720"/>
       <w:docGrid w:linePitch="360"/>
     </w:sectPr>
   </w:body>
 </w:document>
+</file>
+
+<file path=word/numbering.xml><?xml version="1.0" encoding="utf-8"?>
+<w:numbering xmlns:w="http://schemas.openxmlformats.org/wordprocessingml/2006/main">
+  <w:abstractNum xmlns:w="http://schemas.openxmlformats.org/wordprocessingml/2006/main" w:abstractNumId="7">
+    <w:nsid w:val="1ae7e5f6"/>
+    <w:multiLevelType xmlns:w="http://schemas.openxmlformats.org/wordprocessingml/2006/main" w:val="hybridMultilevel"/>
+    <w:lvl xmlns:w="http://schemas.openxmlformats.org/wordprocessingml/2006/main" w:ilvl="0">
+      <w:start w:val="1"/>
+      <w:numFmt w:val="bullet"/>
+      <w:lvlText w:val=""/>
+      <w:lvlJc w:val="left"/>
+      <w:pPr>
+        <w:ind w:left="720" w:hanging="360"/>
+      </w:pPr>
+      <w:rPr>
+        <w:rFonts w:hint="default" w:ascii="Symbol" w:hAnsi="Symbol"/>
+      </w:rPr>
+    </w:lvl>
+    <w:lvl xmlns:w="http://schemas.openxmlformats.org/wordprocessingml/2006/main" w:ilvl="1">
+      <w:start w:val="1"/>
+      <w:numFmt w:val="bullet"/>
+      <w:lvlText w:val="o"/>
+      <w:lvlJc w:val="left"/>
+      <w:pPr>
+        <w:ind w:left="1440" w:hanging="360"/>
+      </w:pPr>
+      <w:rPr>
+        <w:rFonts w:hint="default" w:ascii="Courier New" w:hAnsi="Courier New"/>
+      </w:rPr>
+    </w:lvl>
+    <w:lvl xmlns:w="http://schemas.openxmlformats.org/wordprocessingml/2006/main" w:ilvl="2">
+      <w:start w:val="1"/>
+      <w:numFmt w:val="bullet"/>
+      <w:lvlText w:val=""/>
+      <w:lvlJc w:val="left"/>
+      <w:pPr>
+        <w:ind w:left="2160" w:hanging="360"/>
+      </w:pPr>
+      <w:rPr>
+        <w:rFonts w:hint="default" w:ascii="Wingdings" w:hAnsi="Wingdings"/>
+      </w:rPr>
+    </w:lvl>
+    <w:lvl xmlns:w="http://schemas.openxmlformats.org/wordprocessingml/2006/main" w:ilvl="3">
+      <w:start w:val="1"/>
+      <w:numFmt w:val="bullet"/>
+      <w:lvlText w:val=""/>
+      <w:lvlJc w:val="left"/>
+      <w:pPr>
+        <w:ind w:left="2880" w:hanging="360"/>
+      </w:pPr>
+      <w:rPr>
+        <w:rFonts w:hint="default" w:ascii="Symbol" w:hAnsi="Symbol"/>
+      </w:rPr>
+    </w:lvl>
+    <w:lvl xmlns:w="http://schemas.openxmlformats.org/wordprocessingml/2006/main" w:ilvl="4">
+      <w:start w:val="1"/>
+      <w:numFmt w:val="bullet"/>
+      <w:lvlText w:val="o"/>
+      <w:lvlJc w:val="left"/>
+      <w:pPr>
+        <w:ind w:left="3600" w:hanging="360"/>
+      </w:pPr>
+      <w:rPr>
+        <w:rFonts w:hint="default" w:ascii="Courier New" w:hAnsi="Courier New"/>
+      </w:rPr>
+    </w:lvl>
+    <w:lvl xmlns:w="http://schemas.openxmlformats.org/wordprocessingml/2006/main" w:ilvl="5">
+      <w:start w:val="1"/>
+      <w:numFmt w:val="bullet"/>
+      <w:lvlText w:val=""/>
+      <w:lvlJc w:val="left"/>
+      <w:pPr>
+        <w:ind w:left="4320" w:hanging="360"/>
+      </w:pPr>
+      <w:rPr>
+        <w:rFonts w:hint="default" w:ascii="Wingdings" w:hAnsi="Wingdings"/>
+      </w:rPr>
+    </w:lvl>
+    <w:lvl xmlns:w="http://schemas.openxmlformats.org/wordprocessingml/2006/main" w:ilvl="6">
+      <w:start w:val="1"/>
+      <w:numFmt w:val="bullet"/>
+      <w:lvlText w:val=""/>
+      <w:lvlJc w:val="left"/>
+      <w:pPr>
+        <w:ind w:left="5040" w:hanging="360"/>
+      </w:pPr>
+      <w:rPr>
+        <w:rFonts w:hint="default" w:ascii="Symbol" w:hAnsi="Symbol"/>
+      </w:rPr>
+    </w:lvl>
+    <w:lvl xmlns:w="http://schemas.openxmlformats.org/wordprocessingml/2006/main" w:ilvl="7">
+      <w:start w:val="1"/>
+      <w:numFmt w:val="bullet"/>
+      <w:lvlText w:val="o"/>
+      <w:lvlJc w:val="left"/>
+      <w:pPr>
+        <w:ind w:left="5760" w:hanging="360"/>
+      </w:pPr>
+      <w:rPr>
+        <w:rFonts w:hint="default" w:ascii="Courier New" w:hAnsi="Courier New"/>
+      </w:rPr>
+    </w:lvl>
+    <w:lvl xmlns:w="http://schemas.openxmlformats.org/wordprocessingml/2006/main" w:ilvl="8">
+      <w:start w:val="1"/>
+      <w:numFmt w:val="bullet"/>
+      <w:lvlText w:val=""/>
+      <w:lvlJc w:val="left"/>
+      <w:pPr>
+        <w:ind w:left="6480" w:hanging="360"/>
+      </w:pPr>
+      <w:rPr>
+        <w:rFonts w:hint="default" w:ascii="Wingdings" w:hAnsi="Wingdings"/>
+      </w:rPr>
+    </w:lvl>
+  </w:abstractNum>
+  <w:abstractNum xmlns:w="http://schemas.openxmlformats.org/wordprocessingml/2006/main" w:abstractNumId="6">
+    <w:nsid w:val="46e2577"/>
+    <w:multiLevelType xmlns:w="http://schemas.openxmlformats.org/wordprocessingml/2006/main" w:val="hybridMultilevel"/>
+    <w:lvl xmlns:w="http://schemas.openxmlformats.org/wordprocessingml/2006/main" w:ilvl="0">
+      <w:start w:val="1"/>
+      <w:numFmt w:val="bullet"/>
+      <w:lvlText w:val="o"/>
+      <w:lvlJc w:val="left"/>
+      <w:pPr>
+        <w:ind w:left="1080" w:hanging="360"/>
+      </w:pPr>
+      <w:rPr>
+        <w:rFonts w:hint="default" w:ascii="Courier New" w:hAnsi="Courier New"/>
+      </w:rPr>
+    </w:lvl>
+    <w:lvl xmlns:w="http://schemas.openxmlformats.org/wordprocessingml/2006/main" w:ilvl="1">
+      <w:start w:val="1"/>
+      <w:numFmt w:val="bullet"/>
+      <w:lvlText w:val="o"/>
+      <w:lvlJc w:val="left"/>
+      <w:pPr>
+        <w:ind w:left="1440" w:hanging="360"/>
+      </w:pPr>
+      <w:rPr>
+        <w:rFonts w:hint="default" w:ascii="Courier New" w:hAnsi="Courier New"/>
+      </w:rPr>
+    </w:lvl>
+    <w:lvl xmlns:w="http://schemas.openxmlformats.org/wordprocessingml/2006/main" w:ilvl="2">
+      <w:start w:val="1"/>
+      <w:numFmt w:val="bullet"/>
+      <w:lvlText w:val=""/>
+      <w:lvlJc w:val="left"/>
+      <w:pPr>
+        <w:ind w:left="2160" w:hanging="360"/>
+      </w:pPr>
+      <w:rPr>
+        <w:rFonts w:hint="default" w:ascii="Wingdings" w:hAnsi="Wingdings"/>
+      </w:rPr>
+    </w:lvl>
+    <w:lvl xmlns:w="http://schemas.openxmlformats.org/wordprocessingml/2006/main" w:ilvl="3">
+      <w:start w:val="1"/>
+      <w:numFmt w:val="bullet"/>
+      <w:lvlText w:val=""/>
+      <w:lvlJc w:val="left"/>
+      <w:pPr>
+        <w:ind w:left="2880" w:hanging="360"/>
+      </w:pPr>
+      <w:rPr>
+        <w:rFonts w:hint="default" w:ascii="Symbol" w:hAnsi="Symbol"/>
+      </w:rPr>
+    </w:lvl>
+    <w:lvl xmlns:w="http://schemas.openxmlformats.org/wordprocessingml/2006/main" w:ilvl="4">
+      <w:start w:val="1"/>
+      <w:numFmt w:val="bullet"/>
+      <w:lvlText w:val="o"/>
+      <w:lvlJc w:val="left"/>
+      <w:pPr>
+        <w:ind w:left="3600" w:hanging="360"/>
+      </w:pPr>
+      <w:rPr>
+        <w:rFonts w:hint="default" w:ascii="Courier New" w:hAnsi="Courier New"/>
+      </w:rPr>
+    </w:lvl>
+    <w:lvl xmlns:w="http://schemas.openxmlformats.org/wordprocessingml/2006/main" w:ilvl="5">
+      <w:start w:val="1"/>
+      <w:numFmt w:val="bullet"/>
+      <w:lvlText w:val=""/>
+      <w:lvlJc w:val="left"/>
+      <w:pPr>
+        <w:ind w:left="4320" w:hanging="360"/>
+      </w:pPr>
+      <w:rPr>
+        <w:rFonts w:hint="default" w:ascii="Wingdings" w:hAnsi="Wingdings"/>
+      </w:rPr>
+    </w:lvl>
+    <w:lvl xmlns:w="http://schemas.openxmlformats.org/wordprocessingml/2006/main" w:ilvl="6">
+      <w:start w:val="1"/>
+      <w:numFmt w:val="bullet"/>
+      <w:lvlText w:val=""/>
+      <w:lvlJc w:val="left"/>
+      <w:pPr>
+        <w:ind w:left="5040" w:hanging="360"/>
+      </w:pPr>
+      <w:rPr>
+        <w:rFonts w:hint="default" w:ascii="Symbol" w:hAnsi="Symbol"/>
+      </w:rPr>
+    </w:lvl>
+    <w:lvl xmlns:w="http://schemas.openxmlformats.org/wordprocessingml/2006/main" w:ilvl="7">
+      <w:start w:val="1"/>
+      <w:numFmt w:val="bullet"/>
+      <w:lvlText w:val="o"/>
+      <w:lvlJc w:val="left"/>
+      <w:pPr>
+        <w:ind w:left="5760" w:hanging="360"/>
+      </w:pPr>
+      <w:rPr>
+        <w:rFonts w:hint="default" w:ascii="Courier New" w:hAnsi="Courier New"/>
+      </w:rPr>
+    </w:lvl>
+    <w:lvl xmlns:w="http://schemas.openxmlformats.org/wordprocessingml/2006/main" w:ilvl="8">
+      <w:start w:val="1"/>
+      <w:numFmt w:val="bullet"/>
+      <w:lvlText w:val=""/>
+      <w:lvlJc w:val="left"/>
+      <w:pPr>
+        <w:ind w:left="6480" w:hanging="360"/>
+      </w:pPr>
+      <w:rPr>
+        <w:rFonts w:hint="default" w:ascii="Wingdings" w:hAnsi="Wingdings"/>
+      </w:rPr>
+    </w:lvl>
+  </w:abstractNum>
+  <w:abstractNum xmlns:w="http://schemas.openxmlformats.org/wordprocessingml/2006/main" w:abstractNumId="5">
+    <w:nsid w:val="48c06677"/>
+    <w:multiLevelType xmlns:w="http://schemas.openxmlformats.org/wordprocessingml/2006/main" w:val="hybridMultilevel"/>
+    <w:lvl xmlns:w="http://schemas.openxmlformats.org/wordprocessingml/2006/main" w:ilvl="0">
+      <w:start w:val="1"/>
+      <w:numFmt w:val="bullet"/>
+      <w:lvlText w:val=""/>
+      <w:lvlJc w:val="left"/>
+      <w:pPr>
+        <w:ind w:left="720" w:hanging="360"/>
+      </w:pPr>
+      <w:rPr>
+        <w:rFonts w:hint="default" w:ascii="Symbol" w:hAnsi="Symbol"/>
+      </w:rPr>
+    </w:lvl>
+    <w:lvl xmlns:w="http://schemas.openxmlformats.org/wordprocessingml/2006/main" w:ilvl="1">
+      <w:start w:val="1"/>
+      <w:numFmt w:val="bullet"/>
+      <w:lvlText w:val="o"/>
+      <w:lvlJc w:val="left"/>
+      <w:pPr>
+        <w:ind w:left="1440" w:hanging="360"/>
+      </w:pPr>
+      <w:rPr>
+        <w:rFonts w:hint="default" w:ascii="Courier New" w:hAnsi="Courier New"/>
+      </w:rPr>
+    </w:lvl>
+    <w:lvl xmlns:w="http://schemas.openxmlformats.org/wordprocessingml/2006/main" w:ilvl="2">
+      <w:start w:val="1"/>
+      <w:numFmt w:val="bullet"/>
+      <w:lvlText w:val=""/>
+      <w:lvlJc w:val="left"/>
+      <w:pPr>
+        <w:ind w:left="2160" w:hanging="360"/>
+      </w:pPr>
+      <w:rPr>
+        <w:rFonts w:hint="default" w:ascii="Wingdings" w:hAnsi="Wingdings"/>
+      </w:rPr>
+    </w:lvl>
+    <w:lvl xmlns:w="http://schemas.openxmlformats.org/wordprocessingml/2006/main" w:ilvl="3">
+      <w:start w:val="1"/>
+      <w:numFmt w:val="bullet"/>
+      <w:lvlText w:val=""/>
+      <w:lvlJc w:val="left"/>
+      <w:pPr>
+        <w:ind w:left="2880" w:hanging="360"/>
+      </w:pPr>
+      <w:rPr>
+        <w:rFonts w:hint="default" w:ascii="Symbol" w:hAnsi="Symbol"/>
+      </w:rPr>
+    </w:lvl>
+    <w:lvl xmlns:w="http://schemas.openxmlformats.org/wordprocessingml/2006/main" w:ilvl="4">
+      <w:start w:val="1"/>
+      <w:numFmt w:val="bullet"/>
+      <w:lvlText w:val="o"/>
+      <w:lvlJc w:val="left"/>
+      <w:pPr>
+        <w:ind w:left="3600" w:hanging="360"/>
+      </w:pPr>
+      <w:rPr>
+        <w:rFonts w:hint="default" w:ascii="Courier New" w:hAnsi="Courier New"/>
+      </w:rPr>
+    </w:lvl>
+    <w:lvl xmlns:w="http://schemas.openxmlformats.org/wordprocessingml/2006/main" w:ilvl="5">
+      <w:start w:val="1"/>
+      <w:numFmt w:val="bullet"/>
+      <w:lvlText w:val=""/>
+      <w:lvlJc w:val="left"/>
+      <w:pPr>
+        <w:ind w:left="4320" w:hanging="360"/>
+      </w:pPr>
+      <w:rPr>
+        <w:rFonts w:hint="default" w:ascii="Wingdings" w:hAnsi="Wingdings"/>
+      </w:rPr>
+    </w:lvl>
+    <w:lvl xmlns:w="http://schemas.openxmlformats.org/wordprocessingml/2006/main" w:ilvl="6">
+      <w:start w:val="1"/>
+      <w:numFmt w:val="bullet"/>
+      <w:lvlText w:val=""/>
+      <w:lvlJc w:val="left"/>
+      <w:pPr>
+        <w:ind w:left="5040" w:hanging="360"/>
+      </w:pPr>
+      <w:rPr>
+        <w:rFonts w:hint="default" w:ascii="Symbol" w:hAnsi="Symbol"/>
+      </w:rPr>
+    </w:lvl>
+    <w:lvl xmlns:w="http://schemas.openxmlformats.org/wordprocessingml/2006/main" w:ilvl="7">
+      <w:start w:val="1"/>
+      <w:numFmt w:val="bullet"/>
+      <w:lvlText w:val="o"/>
+      <w:lvlJc w:val="left"/>
+      <w:pPr>
+        <w:ind w:left="5760" w:hanging="360"/>
+      </w:pPr>
+      <w:rPr>
+        <w:rFonts w:hint="default" w:ascii="Courier New" w:hAnsi="Courier New"/>
+      </w:rPr>
+    </w:lvl>
+    <w:lvl xmlns:w="http://schemas.openxmlformats.org/wordprocessingml/2006/main" w:ilvl="8">
+      <w:start w:val="1"/>
+      <w:numFmt w:val="bullet"/>
+      <w:lvlText w:val=""/>
+      <w:lvlJc w:val="left"/>
+      <w:pPr>
+        <w:ind w:left="6480" w:hanging="360"/>
+      </w:pPr>
+      <w:rPr>
+        <w:rFonts w:hint="default" w:ascii="Wingdings" w:hAnsi="Wingdings"/>
+      </w:rPr>
+    </w:lvl>
+  </w:abstractNum>
+  <w:abstractNum xmlns:w="http://schemas.openxmlformats.org/wordprocessingml/2006/main" w:abstractNumId="4">
+    <w:nsid w:val="639ed1b"/>
+    <w:multiLevelType xmlns:w="http://schemas.openxmlformats.org/wordprocessingml/2006/main" w:val="hybridMultilevel"/>
+    <w:lvl xmlns:w="http://schemas.openxmlformats.org/wordprocessingml/2006/main" w:ilvl="0">
+      <w:start w:val="1"/>
+      <w:numFmt w:val="bullet"/>
+      <w:lvlText w:val=""/>
+      <w:lvlJc w:val="left"/>
+      <w:pPr>
+        <w:ind w:left="720" w:hanging="360"/>
+      </w:pPr>
+      <w:rPr>
+        <w:rFonts w:hint="default" w:ascii="Symbol" w:hAnsi="Symbol"/>
+      </w:rPr>
+    </w:lvl>
+    <w:lvl xmlns:w="http://schemas.openxmlformats.org/wordprocessingml/2006/main" w:ilvl="1">
+      <w:start w:val="1"/>
+      <w:numFmt w:val="bullet"/>
+      <w:lvlText w:val="o"/>
+      <w:lvlJc w:val="left"/>
+      <w:pPr>
+        <w:ind w:left="1440" w:hanging="360"/>
+      </w:pPr>
+      <w:rPr>
+        <w:rFonts w:hint="default" w:ascii="Courier New" w:hAnsi="Courier New"/>
+      </w:rPr>
+    </w:lvl>
+    <w:lvl xmlns:w="http://schemas.openxmlformats.org/wordprocessingml/2006/main" w:ilvl="2">
+      <w:start w:val="1"/>
+      <w:numFmt w:val="bullet"/>
+      <w:lvlText w:val=""/>
+      <w:lvlJc w:val="left"/>
+      <w:pPr>
+        <w:ind w:left="2160" w:hanging="360"/>
+      </w:pPr>
+      <w:rPr>
+        <w:rFonts w:hint="default" w:ascii="Wingdings" w:hAnsi="Wingdings"/>
+      </w:rPr>
+    </w:lvl>
+    <w:lvl xmlns:w="http://schemas.openxmlformats.org/wordprocessingml/2006/main" w:ilvl="3">
+      <w:start w:val="1"/>
+      <w:numFmt w:val="bullet"/>
+      <w:lvlText w:val=""/>
+      <w:lvlJc w:val="left"/>
+      <w:pPr>
+        <w:ind w:left="2880" w:hanging="360"/>
+      </w:pPr>
+      <w:rPr>
+        <w:rFonts w:hint="default" w:ascii="Symbol" w:hAnsi="Symbol"/>
+      </w:rPr>
+    </w:lvl>
+    <w:lvl xmlns:w="http://schemas.openxmlformats.org/wordprocessingml/2006/main" w:ilvl="4">
+      <w:start w:val="1"/>
+      <w:numFmt w:val="bullet"/>
+      <w:lvlText w:val="o"/>
+      <w:lvlJc w:val="left"/>
+      <w:pPr>
+        <w:ind w:left="3600" w:hanging="360"/>
+      </w:pPr>
+      <w:rPr>
+        <w:rFonts w:hint="default" w:ascii="Courier New" w:hAnsi="Courier New"/>
+      </w:rPr>
+    </w:lvl>
+    <w:lvl xmlns:w="http://schemas.openxmlformats.org/wordprocessingml/2006/main" w:ilvl="5">
+      <w:start w:val="1"/>
+      <w:numFmt w:val="bullet"/>
+      <w:lvlText w:val=""/>
+      <w:lvlJc w:val="left"/>
+      <w:pPr>
+        <w:ind w:left="4320" w:hanging="360"/>
+      </w:pPr>
+      <w:rPr>
+        <w:rFonts w:hint="default" w:ascii="Wingdings" w:hAnsi="Wingdings"/>
+      </w:rPr>
+    </w:lvl>
+    <w:lvl xmlns:w="http://schemas.openxmlformats.org/wordprocessingml/2006/main" w:ilvl="6">
+      <w:start w:val="1"/>
+      <w:numFmt w:val="bullet"/>
+      <w:lvlText w:val=""/>
+      <w:lvlJc w:val="left"/>
+      <w:pPr>
+        <w:ind w:left="5040" w:hanging="360"/>
+      </w:pPr>
+      <w:rPr>
+        <w:rFonts w:hint="default" w:ascii="Symbol" w:hAnsi="Symbol"/>
+      </w:rPr>
+    </w:lvl>
+    <w:lvl xmlns:w="http://schemas.openxmlformats.org/wordprocessingml/2006/main" w:ilvl="7">
+      <w:start w:val="1"/>
+      <w:numFmt w:val="bullet"/>
+      <w:lvlText w:val="o"/>
+      <w:lvlJc w:val="left"/>
+      <w:pPr>
+        <w:ind w:left="5760" w:hanging="360"/>
+      </w:pPr>
+      <w:rPr>
+        <w:rFonts w:hint="default" w:ascii="Courier New" w:hAnsi="Courier New"/>
+      </w:rPr>
+    </w:lvl>
+    <w:lvl xmlns:w="http://schemas.openxmlformats.org/wordprocessingml/2006/main" w:ilvl="8">
+      <w:start w:val="1"/>
+      <w:numFmt w:val="bullet"/>
+      <w:lvlText w:val=""/>
+      <w:lvlJc w:val="left"/>
+      <w:pPr>
+        <w:ind w:left="6480" w:hanging="360"/>
+      </w:pPr>
+      <w:rPr>
+        <w:rFonts w:hint="default" w:ascii="Wingdings" w:hAnsi="Wingdings"/>
+      </w:rPr>
+    </w:lvl>
+  </w:abstractNum>
+  <w:abstractNum xmlns:w="http://schemas.openxmlformats.org/wordprocessingml/2006/main" w:abstractNumId="3">
+    <w:nsid w:val="1cdc433e"/>
+    <w:multiLevelType xmlns:w="http://schemas.openxmlformats.org/wordprocessingml/2006/main" w:val="hybridMultilevel"/>
+    <w:lvl xmlns:w="http://schemas.openxmlformats.org/wordprocessingml/2006/main" w:ilvl="0">
+      <w:start w:val="1"/>
+      <w:numFmt w:val="bullet"/>
+      <w:lvlText w:val=""/>
+      <w:lvlJc w:val="left"/>
+      <w:pPr>
+        <w:ind w:left="720" w:hanging="360"/>
+      </w:pPr>
+      <w:rPr>
+        <w:rFonts w:hint="default" w:ascii="Symbol" w:hAnsi="Symbol"/>
+      </w:rPr>
+    </w:lvl>
+    <w:lvl xmlns:w="http://schemas.openxmlformats.org/wordprocessingml/2006/main" w:ilvl="1">
+      <w:start w:val="1"/>
+      <w:numFmt w:val="bullet"/>
+      <w:lvlText w:val="o"/>
+      <w:lvlJc w:val="left"/>
+      <w:pPr>
+        <w:ind w:left="1440" w:hanging="360"/>
+      </w:pPr>
+      <w:rPr>
+        <w:rFonts w:hint="default" w:ascii="Courier New" w:hAnsi="Courier New"/>
+      </w:rPr>
+    </w:lvl>
+    <w:lvl xmlns:w="http://schemas.openxmlformats.org/wordprocessingml/2006/main" w:ilvl="2">
+      <w:start w:val="1"/>
+      <w:numFmt w:val="bullet"/>
+      <w:lvlText w:val=""/>
+      <w:lvlJc w:val="left"/>
+      <w:pPr>
+        <w:ind w:left="2160" w:hanging="360"/>
+      </w:pPr>
+      <w:rPr>
+        <w:rFonts w:hint="default" w:ascii="Wingdings" w:hAnsi="Wingdings"/>
+      </w:rPr>
+    </w:lvl>
+    <w:lvl xmlns:w="http://schemas.openxmlformats.org/wordprocessingml/2006/main" w:ilvl="3">
+      <w:start w:val="1"/>
+      <w:numFmt w:val="bullet"/>
+      <w:lvlText w:val=""/>
+      <w:lvlJc w:val="left"/>
+      <w:pPr>
+        <w:ind w:left="2880" w:hanging="360"/>
+      </w:pPr>
+      <w:rPr>
+        <w:rFonts w:hint="default" w:ascii="Symbol" w:hAnsi="Symbol"/>
+      </w:rPr>
+    </w:lvl>
+    <w:lvl xmlns:w="http://schemas.openxmlformats.org/wordprocessingml/2006/main" w:ilvl="4">
+      <w:start w:val="1"/>
+      <w:numFmt w:val="bullet"/>
+      <w:lvlText w:val="o"/>
+      <w:lvlJc w:val="left"/>
+      <w:pPr>
+        <w:ind w:left="3600" w:hanging="360"/>
+      </w:pPr>
+      <w:rPr>
+        <w:rFonts w:hint="default" w:ascii="Courier New" w:hAnsi="Courier New"/>
+      </w:rPr>
+    </w:lvl>
+    <w:lvl xmlns:w="http://schemas.openxmlformats.org/wordprocessingml/2006/main" w:ilvl="5">
+      <w:start w:val="1"/>
+      <w:numFmt w:val="bullet"/>
+      <w:lvlText w:val=""/>
+      <w:lvlJc w:val="left"/>
+      <w:pPr>
+        <w:ind w:left="4320" w:hanging="360"/>
+      </w:pPr>
+      <w:rPr>
+        <w:rFonts w:hint="default" w:ascii="Wingdings" w:hAnsi="Wingdings"/>
+      </w:rPr>
+    </w:lvl>
+    <w:lvl xmlns:w="http://schemas.openxmlformats.org/wordprocessingml/2006/main" w:ilvl="6">
+      <w:start w:val="1"/>
+      <w:numFmt w:val="bullet"/>
+      <w:lvlText w:val=""/>
+      <w:lvlJc w:val="left"/>
+      <w:pPr>
+        <w:ind w:left="5040" w:hanging="360"/>
+      </w:pPr>
+      <w:rPr>
+        <w:rFonts w:hint="default" w:ascii="Symbol" w:hAnsi="Symbol"/>
+      </w:rPr>
+    </w:lvl>
+    <w:lvl xmlns:w="http://schemas.openxmlformats.org/wordprocessingml/2006/main" w:ilvl="7">
+      <w:start w:val="1"/>
+      <w:numFmt w:val="bullet"/>
+      <w:lvlText w:val="o"/>
+      <w:lvlJc w:val="left"/>
+      <w:pPr>
+        <w:ind w:left="5760" w:hanging="360"/>
+      </w:pPr>
+      <w:rPr>
+        <w:rFonts w:hint="default" w:ascii="Courier New" w:hAnsi="Courier New"/>
+      </w:rPr>
+    </w:lvl>
+    <w:lvl xmlns:w="http://schemas.openxmlformats.org/wordprocessingml/2006/main" w:ilvl="8">
+      <w:start w:val="1"/>
+      <w:numFmt w:val="bullet"/>
+      <w:lvlText w:val=""/>
+      <w:lvlJc w:val="left"/>
+      <w:pPr>
+        <w:ind w:left="6480" w:hanging="360"/>
+      </w:pPr>
+      <w:rPr>
+        <w:rFonts w:hint="default" w:ascii="Wingdings" w:hAnsi="Wingdings"/>
+      </w:rPr>
+    </w:lvl>
+  </w:abstractNum>
+  <w:abstractNum xmlns:w="http://schemas.openxmlformats.org/wordprocessingml/2006/main" w:abstractNumId="2">
+    <w:nsid w:val="6c2ad426"/>
+    <w:multiLevelType xmlns:w="http://schemas.openxmlformats.org/wordprocessingml/2006/main" w:val="hybridMultilevel"/>
+    <w:lvl xmlns:w="http://schemas.openxmlformats.org/wordprocessingml/2006/main" w:ilvl="0">
+      <w:start w:val="1"/>
+      <w:numFmt w:val="bullet"/>
+      <w:lvlText w:val=""/>
+      <w:lvlJc w:val="left"/>
+      <w:pPr>
+        <w:ind w:left="720" w:hanging="360"/>
+      </w:pPr>
+      <w:rPr>
+        <w:rFonts w:hint="default" w:ascii="Symbol" w:hAnsi="Symbol"/>
+      </w:rPr>
+    </w:lvl>
+    <w:lvl xmlns:w="http://schemas.openxmlformats.org/wordprocessingml/2006/main" w:ilvl="1">
+      <w:start w:val="1"/>
+      <w:numFmt w:val="bullet"/>
+      <w:lvlText w:val="o"/>
+      <w:lvlJc w:val="left"/>
+      <w:pPr>
+        <w:ind w:left="1440" w:hanging="360"/>
+      </w:pPr>
+      <w:rPr>
+        <w:rFonts w:hint="default" w:ascii="Courier New" w:hAnsi="Courier New"/>
+      </w:rPr>
+    </w:lvl>
+    <w:lvl xmlns:w="http://schemas.openxmlformats.org/wordprocessingml/2006/main" w:ilvl="2">
+      <w:start w:val="1"/>
+      <w:numFmt w:val="bullet"/>
+      <w:lvlText w:val=""/>
+      <w:lvlJc w:val="left"/>
+      <w:pPr>
+        <w:ind w:left="2160" w:hanging="360"/>
+      </w:pPr>
+      <w:rPr>
+        <w:rFonts w:hint="default" w:ascii="Wingdings" w:hAnsi="Wingdings"/>
+      </w:rPr>
+    </w:lvl>
+    <w:lvl xmlns:w="http://schemas.openxmlformats.org/wordprocessingml/2006/main" w:ilvl="3">
+      <w:start w:val="1"/>
+      <w:numFmt w:val="bullet"/>
+      <w:lvlText w:val=""/>
+      <w:lvlJc w:val="left"/>
+      <w:pPr>
+        <w:ind w:left="2880" w:hanging="360"/>
+      </w:pPr>
+      <w:rPr>
+        <w:rFonts w:hint="default" w:ascii="Symbol" w:hAnsi="Symbol"/>
+      </w:rPr>
+    </w:lvl>
+    <w:lvl xmlns:w="http://schemas.openxmlformats.org/wordprocessingml/2006/main" w:ilvl="4">
+      <w:start w:val="1"/>
+      <w:numFmt w:val="bullet"/>
+      <w:lvlText w:val="o"/>
+      <w:lvlJc w:val="left"/>
+      <w:pPr>
+        <w:ind w:left="3600" w:hanging="360"/>
+      </w:pPr>
+      <w:rPr>
+        <w:rFonts w:hint="default" w:ascii="Courier New" w:hAnsi="Courier New"/>
+      </w:rPr>
+    </w:lvl>
+    <w:lvl xmlns:w="http://schemas.openxmlformats.org/wordprocessingml/2006/main" w:ilvl="5">
+      <w:start w:val="1"/>
+      <w:numFmt w:val="bullet"/>
+      <w:lvlText w:val=""/>
+      <w:lvlJc w:val="left"/>
+      <w:pPr>
+        <w:ind w:left="4320" w:hanging="360"/>
+      </w:pPr>
+      <w:rPr>
+        <w:rFonts w:hint="default" w:ascii="Wingdings" w:hAnsi="Wingdings"/>
+      </w:rPr>
+    </w:lvl>
+    <w:lvl xmlns:w="http://schemas.openxmlformats.org/wordprocessingml/2006/main" w:ilvl="6">
+      <w:start w:val="1"/>
+      <w:numFmt w:val="bullet"/>
+      <w:lvlText w:val=""/>
+      <w:lvlJc w:val="left"/>
+      <w:pPr>
+        <w:ind w:left="5040" w:hanging="360"/>
+      </w:pPr>
+      <w:rPr>
+        <w:rFonts w:hint="default" w:ascii="Symbol" w:hAnsi="Symbol"/>
+      </w:rPr>
+    </w:lvl>
+    <w:lvl xmlns:w="http://schemas.openxmlformats.org/wordprocessingml/2006/main" w:ilvl="7">
+      <w:start w:val="1"/>
+      <w:numFmt w:val="bullet"/>
+      <w:lvlText w:val="o"/>
+      <w:lvlJc w:val="left"/>
+      <w:pPr>
+        <w:ind w:left="5760" w:hanging="360"/>
+      </w:pPr>
+      <w:rPr>
+        <w:rFonts w:hint="default" w:ascii="Courier New" w:hAnsi="Courier New"/>
+      </w:rPr>
+    </w:lvl>
+    <w:lvl xmlns:w="http://schemas.openxmlformats.org/wordprocessingml/2006/main" w:ilvl="8">
+      <w:start w:val="1"/>
+      <w:numFmt w:val="bullet"/>
+      <w:lvlText w:val=""/>
+      <w:lvlJc w:val="left"/>
+      <w:pPr>
+        <w:ind w:left="6480" w:hanging="360"/>
+      </w:pPr>
+      <w:rPr>
+        <w:rFonts w:hint="default" w:ascii="Wingdings" w:hAnsi="Wingdings"/>
+      </w:rPr>
+    </w:lvl>
+  </w:abstractNum>
+  <w:abstractNum xmlns:w="http://schemas.openxmlformats.org/wordprocessingml/2006/main" w:abstractNumId="1">
+    <w:nsid w:val="26243af5"/>
+    <w:multiLevelType xmlns:w="http://schemas.openxmlformats.org/wordprocessingml/2006/main" w:val="hybridMultilevel"/>
+    <w:lvl xmlns:w="http://schemas.openxmlformats.org/wordprocessingml/2006/main" w:ilvl="0">
+      <w:start w:val="1"/>
+      <w:numFmt w:val="bullet"/>
+      <w:lvlText w:val=""/>
+      <w:lvlJc w:val="left"/>
+      <w:pPr>
+        <w:ind w:left="720" w:hanging="360"/>
+      </w:pPr>
+      <w:rPr>
+        <w:rFonts w:hint="default" w:ascii="Symbol" w:hAnsi="Symbol"/>
+      </w:rPr>
+    </w:lvl>
+    <w:lvl xmlns:w="http://schemas.openxmlformats.org/wordprocessingml/2006/main" w:ilvl="1">
+      <w:start w:val="1"/>
+      <w:numFmt w:val="bullet"/>
+      <w:lvlText w:val="o"/>
+      <w:lvlJc w:val="left"/>
+      <w:pPr>
+        <w:ind w:left="1440" w:hanging="360"/>
+      </w:pPr>
+      <w:rPr>
+        <w:rFonts w:hint="default" w:ascii="Courier New" w:hAnsi="Courier New"/>
+      </w:rPr>
+    </w:lvl>
+    <w:lvl xmlns:w="http://schemas.openxmlformats.org/wordprocessingml/2006/main" w:ilvl="2">
+      <w:start w:val="1"/>
+      <w:numFmt w:val="bullet"/>
+      <w:lvlText w:val=""/>
+      <w:lvlJc w:val="left"/>
+      <w:pPr>
+        <w:ind w:left="2160" w:hanging="360"/>
+      </w:pPr>
+      <w:rPr>
+        <w:rFonts w:hint="default" w:ascii="Wingdings" w:hAnsi="Wingdings"/>
+      </w:rPr>
+    </w:lvl>
+    <w:lvl xmlns:w="http://schemas.openxmlformats.org/wordprocessingml/2006/main" w:ilvl="3">
+      <w:start w:val="1"/>
+      <w:numFmt w:val="bullet"/>
+      <w:lvlText w:val=""/>
+      <w:lvlJc w:val="left"/>
+      <w:pPr>
+        <w:ind w:left="2880" w:hanging="360"/>
+      </w:pPr>
+      <w:rPr>
+        <w:rFonts w:hint="default" w:ascii="Symbol" w:hAnsi="Symbol"/>
+      </w:rPr>
+    </w:lvl>
+    <w:lvl xmlns:w="http://schemas.openxmlformats.org/wordprocessingml/2006/main" w:ilvl="4">
+      <w:start w:val="1"/>
+      <w:numFmt w:val="bullet"/>
+      <w:lvlText w:val="o"/>
+      <w:lvlJc w:val="left"/>
+      <w:pPr>
+        <w:ind w:left="3600" w:hanging="360"/>
+      </w:pPr>
+      <w:rPr>
+        <w:rFonts w:hint="default" w:ascii="Courier New" w:hAnsi="Courier New"/>
+      </w:rPr>
+    </w:lvl>
+    <w:lvl xmlns:w="http://schemas.openxmlformats.org/wordprocessingml/2006/main" w:ilvl="5">
+      <w:start w:val="1"/>
+      <w:numFmt w:val="bullet"/>
+      <w:lvlText w:val=""/>
+      <w:lvlJc w:val="left"/>
+      <w:pPr>
+        <w:ind w:left="4320" w:hanging="360"/>
+      </w:pPr>
+      <w:rPr>
+        <w:rFonts w:hint="default" w:ascii="Wingdings" w:hAnsi="Wingdings"/>
+      </w:rPr>
+    </w:lvl>
+    <w:lvl xmlns:w="http://schemas.openxmlformats.org/wordprocessingml/2006/main" w:ilvl="6">
+      <w:start w:val="1"/>
+      <w:numFmt w:val="bullet"/>
+      <w:lvlText w:val=""/>
+      <w:lvlJc w:val="left"/>
+      <w:pPr>
+        <w:ind w:left="5040" w:hanging="360"/>
+      </w:pPr>
+      <w:rPr>
+        <w:rFonts w:hint="default" w:ascii="Symbol" w:hAnsi="Symbol"/>
+      </w:rPr>
+    </w:lvl>
+    <w:lvl xmlns:w="http://schemas.openxmlformats.org/wordprocessingml/2006/main" w:ilvl="7">
+      <w:start w:val="1"/>
+      <w:numFmt w:val="bullet"/>
+      <w:lvlText w:val="o"/>
+      <w:lvlJc w:val="left"/>
+      <w:pPr>
+        <w:ind w:left="5760" w:hanging="360"/>
+      </w:pPr>
+      <w:rPr>
+        <w:rFonts w:hint="default" w:ascii="Courier New" w:hAnsi="Courier New"/>
+      </w:rPr>
+    </w:lvl>
+    <w:lvl xmlns:w="http://schemas.openxmlformats.org/wordprocessingml/2006/main" w:ilvl="8">
+      <w:start w:val="1"/>
+      <w:numFmt w:val="bullet"/>
+      <w:lvlText w:val=""/>
+      <w:lvlJc w:val="left"/>
+      <w:pPr>
+        <w:ind w:left="6480" w:hanging="360"/>
+      </w:pPr>
+      <w:rPr>
+        <w:rFonts w:hint="default" w:ascii="Wingdings" w:hAnsi="Wingdings"/>
+      </w:rPr>
+    </w:lvl>
+  </w:abstractNum>
+  <w:num w:numId="7">
+    <w:abstractNumId w:val="7"/>
+  </w:num>
+  <w:num w:numId="6">
+    <w:abstractNumId w:val="6"/>
+  </w:num>
+  <w:num w:numId="5">
+    <w:abstractNumId w:val="5"/>
+  </w:num>
+  <w:num w:numId="4">
+    <w:abstractNumId w:val="4"/>
+  </w:num>
+  <w:num w:numId="3">
+    <w:abstractNumId w:val="3"/>
+  </w:num>
+  <w:num w:numId="2">
+    <w:abstractNumId w:val="2"/>
+  </w:num>
+  <w:num w:numId="1">
+    <w:abstractNumId w:val="1"/>
+  </w:num>
+</w:numbering>
 </file>
 
 <file path=word/styles.xml><?xml version="1.0" encoding="utf-8"?>
@@ -434,6 +3127,70 @@
     <w:semiHidden/>
     <w:unhideWhenUsed/>
   </w:style>
+  <w:style w:type="paragraph" w:styleId="Heading1">
+    <w:uiPriority w:val="9"/>
+    <w:name w:val="heading 1"/>
+    <w:basedOn w:val="Normal"/>
+    <w:next w:val="Normal"/>
+    <w:qFormat/>
+    <w:rsid w:val="761D0FAF"/>
+    <w:rPr>
+      <w:rFonts w:ascii="Aptos Display" w:hAnsi="Aptos Display" w:eastAsia="" w:cs="" w:asciiTheme="majorAscii" w:hAnsiTheme="majorAscii" w:eastAsiaTheme="majorEastAsia" w:cstheme="majorBidi"/>
+      <w:color w:val="0F4761" w:themeColor="accent1" w:themeTint="FF" w:themeShade="BF"/>
+      <w:sz w:val="40"/>
+      <w:szCs w:val="40"/>
+    </w:rPr>
+    <w:pPr>
+      <w:keepNext w:val="1"/>
+      <w:keepLines w:val="1"/>
+      <w:spacing w:before="360" w:after="80"/>
+      <w:outlineLvl w:val="0"/>
+    </w:pPr>
+  </w:style>
+  <w:style w:type="paragraph" w:styleId="Heading2">
+    <w:uiPriority w:val="9"/>
+    <w:name w:val="heading 2"/>
+    <w:basedOn w:val="Normal"/>
+    <w:next w:val="Normal"/>
+    <w:unhideWhenUsed/>
+    <w:qFormat/>
+    <w:rsid w:val="761D0FAF"/>
+    <w:rPr>
+      <w:rFonts w:ascii="Aptos Display" w:hAnsi="Aptos Display" w:eastAsia="" w:cs="" w:asciiTheme="majorAscii" w:hAnsiTheme="majorAscii" w:eastAsiaTheme="majorEastAsia" w:cstheme="majorBidi"/>
+      <w:color w:val="0F4761" w:themeColor="accent1" w:themeTint="FF" w:themeShade="BF"/>
+      <w:sz w:val="32"/>
+      <w:szCs w:val="32"/>
+    </w:rPr>
+    <w:pPr>
+      <w:keepNext w:val="1"/>
+      <w:keepLines w:val="1"/>
+      <w:spacing w:before="160" w:after="80"/>
+      <w:outlineLvl w:val="1"/>
+    </w:pPr>
+  </w:style>
+  <w:style w:type="paragraph" w:styleId="ListParagraph">
+    <w:uiPriority w:val="34"/>
+    <w:name w:val="List Paragraph"/>
+    <w:basedOn w:val="Normal"/>
+    <w:qFormat/>
+    <w:rsid w:val="761D0FAF"/>
+    <w:pPr>
+      <w:spacing/>
+      <w:ind w:left="720"/>
+      <w:contextualSpacing/>
+    </w:pPr>
+  </w:style>
+  <w:style w:type="character" w:styleId="Hyperlink">
+    <w:uiPriority w:val="99"/>
+    <w:name w:val="Hyperlink"/>
+    <w:basedOn w:val="DefaultParagraphFont"/>
+    <w:unhideWhenUsed/>
+    <w:rsid w:val="761D0FAF"/>
+    <w:rPr>
+      <w:color w:val="467886"/>
+      <w:u w:val="single"/>
+    </w:rPr>
+  </w:style>
 </w:styles>
 </file>
 

</xml_diff>